<commit_message>
Restore ML keyword coverage and clarify research experience
</commit_message>
<xml_diff>
--- a/LawrenceDuResume.docx
+++ b/LawrenceDuResume.docx
@@ -2,7 +2,7 @@
 <file path=word/document.xml><?xml version="1.0" encoding="utf-8"?>
 <w:document xmlns:w="http://schemas.openxmlformats.org/wordprocessingml/2006/main" xmlns:m="http://schemas.openxmlformats.org/officeDocument/2006/math" xmlns:r="http://schemas.openxmlformats.org/officeDocument/2006/relationships" xmlns:o="urn:schemas-microsoft-com:office:office" xmlns:v="urn:schemas-microsoft-com:vml" xmlns:w10="urn:schemas-microsoft-com:office:word" xmlns:a="http://schemas.openxmlformats.org/drawingml/2006/main" xmlns:pic="http://schemas.openxmlformats.org/drawingml/2006/picture" xmlns:wp="http://schemas.openxmlformats.org/drawingml/2006/wordprocessingDrawing">
   <w:body>
-    <w:bookmarkStart w:id="34" w:name="_9682c7db4b1149296302af4e4041422a692422f"/>
+    <w:bookmarkStart w:id="37" w:name="_9682c7db4b1149296302af4e4041422a692422f"/>
     <w:p>
       <w:pPr>
         <w:pStyle w:val="Heading1"/>
@@ -20,7 +20,7 @@
           <w:b/>
           <w:bCs/>
         </w:rPr>
-        <w:t xml:space="preserve">Machine Learning Engineering • ML Platforms • MLOps</w:t>
+        <w:t xml:space="preserve">Machine Learning Engineering • Computational Biology • MLOps</w:t>
       </w:r>
     </w:p>
     <w:p>
@@ -113,7 +113,7 @@
         <w:t xml:space="preserve"> </w:t>
       </w:r>
       <w:r>
-        <w:t xml:space="preserve">Python, SQL, C/C++, C#, Rust, Bash</w:t>
+        <w:t xml:space="preserve">Python, SQL, C/C++, C#, Rust, Java, Dart, Bash, HTML/CSS, MATLAB</w:t>
       </w:r>
       <w:r>
         <w:br/>
@@ -129,7 +129,7 @@
         <w:t xml:space="preserve"> </w:t>
       </w:r>
       <w:r>
-        <w:t xml:space="preserve">PyTorch, TensorFlow, Ray, MLflow, NumPy, pandas, scikit-learn</w:t>
+        <w:t xml:space="preserve">PyTorch, TensorFlow, scikit-learn (sklearn), NumPy, pandas, Numba, Ray, MLflow, Flask</w:t>
       </w:r>
       <w:r>
         <w:br/>
@@ -139,13 +139,13 @@
           <w:b/>
           <w:bCs/>
         </w:rPr>
-        <w:t xml:space="preserve">Infrastructure:</w:t>
-      </w:r>
-      <w:r>
-        <w:t xml:space="preserve"> </w:t>
-      </w:r>
-      <w:r>
-        <w:t xml:space="preserve">AWS, Google Cloud, Kubernetes, Docker, Terraform, Pulumi, Metaflow</w:t>
+        <w:t xml:space="preserve">Cloud/MLOps:</w:t>
+      </w:r>
+      <w:r>
+        <w:t xml:space="preserve"> </w:t>
+      </w:r>
+      <w:r>
+        <w:t xml:space="preserve">Amazon Web Services (AWS), Google Cloud Platform (GCP), Kubernetes, Docker, Terraform, Pulumi, Metaflow</w:t>
       </w:r>
       <w:r>
         <w:br/>
@@ -155,17 +155,17 @@
           <w:b/>
           <w:bCs/>
         </w:rPr>
-        <w:t xml:space="preserve">Methods:</w:t>
-      </w:r>
-      <w:r>
-        <w:t xml:space="preserve"> </w:t>
-      </w:r>
-      <w:r>
-        <w:t xml:space="preserve">Foundation model fine-tuning, transformers, diffusion, single-cell analysis, RAG, MCP, graph community detection</w:t>
+        <w:t xml:space="preserve">ML &amp; scientific computing:</w:t>
+      </w:r>
+      <w:r>
+        <w:t xml:space="preserve"> </w:t>
+      </w:r>
+      <w:r>
+        <w:t xml:space="preserve">Foundation model fine-tuning, deep learning, transformers, convolutional neural networks (CNNs), graph neural networks (GNNs), diffusion, Louvain/Leiden community detection, SVM, PCA, KNN, decision trees</w:t>
       </w:r>
     </w:p>
     <w:bookmarkEnd w:id="13"/>
-    <w:bookmarkStart w:id="28" w:name="_experience"/>
+    <w:bookmarkStart w:id="31" w:name="_experience"/>
     <w:p>
       <w:pPr>
         <w:pStyle w:val="Heading2"/>
@@ -212,7 +212,7 @@
         </w:numPr>
       </w:pPr>
       <w:r>
-        <w:t xml:space="preserve">Built a sequence foundation model fine-tuning platform for RNA property and single-cell perturbation prediction, cutting iteration time</w:t>
+        <w:t xml:space="preserve">Built a sequence foundation model fine-tuning platform for RNA properties and single-cell RNA-seq perturbation prediction; cut iteration time</w:t>
       </w:r>
       <w:r>
         <w:t xml:space="preserve"> </w:t>
@@ -237,7 +237,7 @@
         </w:numPr>
       </w:pPr>
       <w:r>
-        <w:t xml:space="preserve">Integrated Segment Anything Model (SAM) segmentation into production image-embedding pipelines for single-cell tracking and cell-state world modeling across</w:t>
+        <w:t xml:space="preserve">Integrated Segment Anything Model (SAM) image segmentation into production computer vision and embedding pipelines for single-cell tracking and cell-state world modeling across</w:t>
       </w:r>
       <w:r>
         <w:t xml:space="preserve"> </w:t>
@@ -275,7 +275,10 @@
         <w:t xml:space="preserve">&gt;3 million iPSC-to-microglia cells</w:t>
       </w:r>
       <w:r>
-        <w:t xml:space="preserve">, supporting Alzheimer’s disease research.</w:t>
+        <w:t xml:space="preserve"> </w:t>
+      </w:r>
+      <w:r>
+        <w:t xml:space="preserve">in Alzheimer’s research.</w:t>
       </w:r>
     </w:p>
     <w:p>
@@ -287,7 +290,7 @@
         </w:numPr>
       </w:pPr>
       <w:r>
-        <w:t xml:space="preserve">Piloted x-prediction / JiT diffusion models generating protein subcellular localization images from ESM protein embeddings.</w:t>
+        <w:t xml:space="preserve">Piloted generative AI for protein subcellular localization images: x-prediction / JiT diffusion using ESM protein embeddings.</w:t>
       </w:r>
     </w:p>
     <w:p>
@@ -299,7 +302,7 @@
         </w:numPr>
       </w:pPr>
       <w:r>
-        <w:t xml:space="preserve">Built a retrieval-augmented LLM pipeline prioritizing</w:t>
+        <w:t xml:space="preserve">Built a pipeline using large language models (LLMs) for retrieval-augmented generation (RAG) and gene-candidate evaluation; prioritized</w:t>
       </w:r>
       <w:r>
         <w:t xml:space="preserve"> </w:t>
@@ -309,13 +312,13 @@
           <w:b/>
           <w:bCs/>
         </w:rPr>
-        <w:t xml:space="preserve">~1,000 candidate genes</w:t>
-      </w:r>
-      <w:r>
-        <w:t xml:space="preserve"> </w:t>
-      </w:r>
-      <w:r>
-        <w:t xml:space="preserve">for a lung-epithelium CRISPR knockout screen supporting a next-generation COPD drug program.</w:t>
+        <w:t xml:space="preserve">~1,000 genes</w:t>
+      </w:r>
+      <w:r>
+        <w:t xml:space="preserve"> </w:t>
+      </w:r>
+      <w:r>
+        <w:t xml:space="preserve">for a lung-epithelium CRISPR knockout screen supporting a COPD drug program.</w:t>
       </w:r>
     </w:p>
     <w:p>
@@ -327,7 +330,7 @@
         </w:numPr>
       </w:pPr>
       <w:r>
-        <w:t xml:space="preserve">Shipped MCP servers enabling company-wide LLM assistants to build and launch scientists’ image-analysis pipelines, accelerating analysis turnaround</w:t>
+        <w:t xml:space="preserve">Shipped Model Context Protocol (MCP) servers enabling company-wide LLM assistants to build and launch image-analysis pipelines; accelerated analysis turnaround</w:t>
       </w:r>
       <w:r>
         <w:t xml:space="preserve"> </w:t>
@@ -341,6 +344,18 @@
       </w:r>
       <w:r>
         <w:t xml:space="preserve">.</w:t>
+      </w:r>
+    </w:p>
+    <w:p>
+      <w:pPr>
+        <w:pStyle w:val="Compact"/>
+        <w:numPr>
+          <w:ilvl w:val="0"/>
+          <w:numId w:val="1001"/>
+        </w:numPr>
+      </w:pPr>
+      <w:r>
+        <w:t xml:space="preserve">Conducted interviews for team hiring; contributing to LLM benchmarking currently in development.</w:t>
       </w:r>
     </w:p>
     <w:bookmarkEnd w:id="15"/>
@@ -383,7 +398,7 @@
         </w:numPr>
       </w:pPr>
       <w:r>
-        <w:t xml:space="preserve">Led development of a distributed ML platform for cancer detection using PyTorch, Ray, and Kubernetes; accelerated training</w:t>
+        <w:t xml:space="preserve">Led greenfield distributed ML platform development with PyTorch, Ray, and Kubernetes for DNA methylation/protein cancer detection; accelerated model training</w:t>
       </w:r>
       <w:r>
         <w:t xml:space="preserve"> </w:t>
@@ -411,7 +426,7 @@
         </w:numPr>
       </w:pPr>
       <w:r>
-        <w:t xml:space="preserve">Deployed organization-wide MLflow tracking on Google Cloud with Terraform and Pulumi; automated reproducible reporting and reduced researcher manual effort</w:t>
+        <w:t xml:space="preserve">Deployed organization-wide MLflow experiment tracking and automated reporting on GCP with Terraform/Pulumi; reduced manual research effort</w:t>
       </w:r>
       <w:r>
         <w:t xml:space="preserve"> </w:t>
@@ -436,7 +451,7 @@
         </w:numPr>
       </w:pPr>
       <w:r>
-        <w:t xml:space="preserve">Built multitask neural networks and elastic net models for colorectal cancer risk from cell-free DNA in a clinical trial cohort of</w:t>
+        <w:t xml:space="preserve">Built PyTorch multitask neural networks and elastic net models for colorectal cancer risk from cell-free DNA in</w:t>
       </w:r>
       <w:r>
         <w:t xml:space="preserve"> </w:t>
@@ -446,10 +461,22 @@
           <w:b/>
           <w:bCs/>
         </w:rPr>
-        <w:t xml:space="preserve">&gt;27,000 individuals</w:t>
+        <w:t xml:space="preserve">&gt;27,000 clinical trial participants</w:t>
       </w:r>
       <w:r>
         <w:t xml:space="preserve">.</w:t>
+      </w:r>
+    </w:p>
+    <w:p>
+      <w:pPr>
+        <w:pStyle w:val="Compact"/>
+        <w:numPr>
+          <w:ilvl w:val="0"/>
+          <w:numId w:val="1002"/>
+        </w:numPr>
+      </w:pPr>
+      <w:r>
+        <w:t xml:space="preserve">Piloted GPT-4 biomedical natural language processing (NLP) and fine-tuned an open-source LLM with direct preference optimization (DPO) for literature summarization and feature extraction.</w:t>
       </w:r>
     </w:p>
     <w:bookmarkEnd w:id="18"/>
@@ -492,7 +519,7 @@
         </w:numPr>
       </w:pPr>
       <w:r>
-        <w:t xml:space="preserve">Created and deployed Recent Ancestor Locations (RAL), a high-precision country-matching algorithm serving</w:t>
+        <w:t xml:space="preserve">Deployed Recent Ancestor Locations (RAL) country matching for</w:t>
       </w:r>
       <w:r>
         <w:t xml:space="preserve"> </w:t>
@@ -505,7 +532,7 @@
         <w:t xml:space="preserve">&gt;15 million customers</w:t>
       </w:r>
       <w:r>
-        <w:t xml:space="preserve">; advanced graph community detection for genetic subpopulations in Mexico and the UK.</w:t>
+        <w:t xml:space="preserve">; used identity-by-descent (IBD) graphs and community detection to identify genetic subpopulations.</w:t>
       </w:r>
     </w:p>
     <w:p>
@@ -517,10 +544,7 @@
         </w:numPr>
       </w:pPr>
       <w:r>
-        <w:t xml:space="preserve">Built SNP feature engineering pipelines at</w:t>
-      </w:r>
-      <w:r>
-        <w:t xml:space="preserve"> </w:t>
+        <w:t xml:space="preserve">Built large-scale data pipelines for SNP feature engineering and ETL (</w:t>
       </w:r>
       <w:r>
         <w:rPr>
@@ -530,10 +554,7 @@
         <w:t xml:space="preserve">~10 million samples × ~1 million SNPs</w:t>
       </w:r>
       <w:r>
-        <w:t xml:space="preserve"> </w:t>
-      </w:r>
-      <w:r>
-        <w:t xml:space="preserve">using AWS Batch, Metaflow, Glue, and Athena for genome-wide association studies and polygenic risk scores (PRS).</w:t>
+        <w:t xml:space="preserve">) with AWS Batch/Glue/Athena and Metaflow; enabled genome-wide association studies (GWAS) and polygenic risk scores (PRS).</w:t>
       </w:r>
     </w:p>
     <w:p>
@@ -545,7 +566,7 @@
         </w:numPr>
       </w:pPr>
       <w:r>
-        <w:t xml:space="preserve">Improved type 2 diabetes and coronary artery disease PRS models using stacking ensembles; automated classifier reports with MLflow and Jupyter, reducing analysis time</w:t>
+        <w:t xml:space="preserve">Improved type 2 diabetes and coronary artery disease PRS with stacking ensembles; automated MLflow/Jupyter model evaluation, cutting analysis</w:t>
       </w:r>
       <w:r>
         <w:t xml:space="preserve"> </w:t>
@@ -563,7 +584,7 @@
     </w:p>
     <w:bookmarkEnd w:id="21"/>
     <w:bookmarkEnd w:id="22"/>
-    <w:bookmarkStart w:id="24" w:name="_c5a0f75213a506673da697146594371cf5b0069"/>
+    <w:bookmarkStart w:id="24" w:name="_3db70173039e70773c59322cbf246eb4e2b86bc"/>
     <w:p>
       <w:pPr>
         <w:pStyle w:val="Heading4"/>
@@ -580,7 +601,7 @@
         <w:t xml:space="preserve"> </w:t>
       </w:r>
       <w:r>
-        <w:t xml:space="preserve">• Bioinformatician IV • May–Oct 2018</w:t>
+        <w:t xml:space="preserve">• Bioinformatician IV • May 2018 – Oct 2018</w:t>
       </w:r>
     </w:p>
     <w:p>
@@ -588,7 +609,7 @@
         <w:pStyle w:val="FirstParagraph"/>
       </w:pPr>
       <w:r>
-        <w:t xml:space="preserve">Developed an RNA-based transplant rejection classifier and Nanopore pipelines using Common Workflow Language.</w:t>
+        <w:t xml:space="preserve">Built an RNA-based transplant rejection classifier and Nanopore bioinformatics pipelines with Common Workflow Language (CWL).</w:t>
       </w:r>
     </w:p>
     <w:bookmarkEnd w:id="24"/>
@@ -635,8 +656,51 @@
       </w:r>
     </w:p>
     <w:bookmarkEnd w:id="27"/>
-    <w:bookmarkEnd w:id="28"/>
-    <w:bookmarkStart w:id="30" w:name="_education"/>
+    <w:bookmarkStart w:id="30" w:name="_2d2c5d052fcac17d5811817cc98435bc880b703"/>
+    <w:p>
+      <w:pPr>
+        <w:pStyle w:val="Heading4"/>
+      </w:pPr>
+      <w:hyperlink r:id="rId28">
+        <w:r>
+          <w:rPr>
+            <w:rStyle w:val="Hyperlink"/>
+          </w:rPr>
+          <w:t xml:space="preserve">Insight</w:t>
+        </w:r>
+      </w:hyperlink>
+      <w:r>
+        <w:t xml:space="preserve"> </w:t>
+      </w:r>
+      <w:r>
+        <w:t xml:space="preserve">• Data Science Fellow • Jan 2017 – Apr 2017</w:t>
+      </w:r>
+    </w:p>
+    <w:p>
+      <w:pPr>
+        <w:pStyle w:val="FirstParagraph"/>
+      </w:pPr>
+      <w:r>
+        <w:t xml:space="preserve">Built</w:t>
+      </w:r>
+      <w:r>
+        <w:t xml:space="preserve"> </w:t>
+      </w:r>
+      <w:hyperlink r:id="rId29">
+        <w:r>
+          <w:rPr>
+            <w:rStyle w:val="Hyperlink"/>
+          </w:rPr>
+          <w:t xml:space="preserve">DeepPixelMonster</w:t>
+        </w:r>
+      </w:hyperlink>
+      <w:r>
+        <w:t xml:space="preserve">, a TensorFlow generative adversarial network (GAN) for pixel art; deployed with Flask on AWS EC2.</w:t>
+      </w:r>
+    </w:p>
+    <w:bookmarkEnd w:id="30"/>
+    <w:bookmarkEnd w:id="31"/>
+    <w:bookmarkStart w:id="33" w:name="_education"/>
     <w:p>
       <w:pPr>
         <w:pStyle w:val="Heading2"/>
@@ -660,12 +724,18 @@
         <w:t xml:space="preserve"> </w:t>
       </w:r>
       <w:r>
-        <w:t xml:space="preserve">• UC San Diego • 2010–2017 • Rifkin Lab;</w:t>
-      </w:r>
-      <w:r>
-        <w:t xml:space="preserve"> </w:t>
-      </w:r>
-      <w:hyperlink r:id="rId29">
+        <w:t xml:space="preserve">• UC San Diego • 2010–2017 • Scott A. Rifkin Lab</w:t>
+      </w:r>
+      <w:r>
+        <w:br/>
+      </w:r>
+      <w:r>
+        <w:t xml:space="preserve">Research:</w:t>
+      </w:r>
+      <w:r>
+        <w:t xml:space="preserve"> </w:t>
+      </w:r>
+      <w:hyperlink r:id="rId32">
         <w:r>
           <w:rPr>
             <w:rStyle w:val="Hyperlink"/>
@@ -677,7 +747,52 @@
         <w:t xml:space="preserve"> </w:t>
       </w:r>
       <w:r>
-        <w:t xml:space="preserve">CNN sequence classification</w:t>
+        <w:t xml:space="preserve">CNNs for</w:t>
+      </w:r>
+      <w:r>
+        <w:t xml:space="preserve"> </w:t>
+      </w:r>
+      <w:r>
+        <w:rPr>
+          <w:b/>
+          <w:bCs/>
+        </w:rPr>
+        <w:t xml:space="preserve">&gt;500,000</w:t>
+      </w:r>
+      <w:r>
+        <w:t xml:space="preserve"> </w:t>
+      </w:r>
+      <w:r>
+        <w:t xml:space="preserve">transcription start site and</w:t>
+      </w:r>
+      <w:r>
+        <w:t xml:space="preserve"> </w:t>
+      </w:r>
+      <w:r>
+        <w:rPr>
+          <w:b/>
+          <w:bCs/>
+        </w:rPr>
+        <w:t xml:space="preserve">&gt;60,000</w:t>
+      </w:r>
+      <w:r>
+        <w:t xml:space="preserve"> </w:t>
+      </w:r>
+      <w:r>
+        <w:t xml:space="preserve">microRNA target sequences; MATLAB image segmentation, fluorescence quantification, and deconvolution of RNA expression in</w:t>
+      </w:r>
+      <w:r>
+        <w:t xml:space="preserve"> </w:t>
+      </w:r>
+      <w:r>
+        <w:rPr>
+          <w:b/>
+          <w:bCs/>
+        </w:rPr>
+        <w:t xml:space="preserve">&gt;5,000 embryos</w:t>
+      </w:r>
+      <w:r>
+        <w:t xml:space="preserve">.</w:t>
       </w:r>
       <w:r>
         <w:br/>
@@ -706,8 +821,8 @@
         <w:t xml:space="preserve">magna cum laude</w:t>
       </w:r>
     </w:p>
-    <w:bookmarkEnd w:id="30"/>
-    <w:bookmarkStart w:id="33" w:name="_2bfd2208116bc8760116e98d98c4644648e3554"/>
+    <w:bookmarkEnd w:id="33"/>
+    <w:bookmarkStart w:id="36" w:name="_2bfd2208116bc8760116e98d98c4644648e3554"/>
     <w:p>
       <w:pPr>
         <w:pStyle w:val="Heading2"/>
@@ -720,7 +835,7 @@
       <w:pPr>
         <w:pStyle w:val="FirstParagraph"/>
       </w:pPr>
-      <w:hyperlink r:id="rId31">
+      <w:hyperlink r:id="rId34">
         <w:r>
           <w:rPr>
             <w:rStyle w:val="Hyperlink"/>
@@ -734,12 +849,12 @@
         <w:t xml:space="preserve"> </w:t>
       </w:r>
       <w:r>
-        <w:t xml:space="preserve">— Unity/C# VR space simulator; AI flight planning, procedural missions, text-to-speech; 72 FPS on Quest 2, 90 FPS on Quest 3.</w:t>
+        <w:t xml:space="preserve">— Unity/C# VR space simulator; behavior trees, AI flight planning, procedural missions, text-to-speech.</w:t>
       </w:r>
       <w:r>
         <w:br/>
       </w:r>
-      <w:hyperlink r:id="rId32">
+      <w:hyperlink r:id="rId35">
         <w:r>
           <w:rPr>
             <w:rStyle w:val="Hyperlink"/>
@@ -753,11 +868,11 @@
         <w:t xml:space="preserve"> </w:t>
       </w:r>
       <w:r>
-        <w:t xml:space="preserve">— Denoising diffusion probabilistic model (DDPM) image generator.</w:t>
-      </w:r>
-    </w:p>
-    <w:bookmarkEnd w:id="33"/>
-    <w:bookmarkEnd w:id="34"/>
+        <w:t xml:space="preserve">— Open-source denoising diffusion probabilistic model (DDPM) image generator.</w:t>
+      </w:r>
+    </w:p>
+    <w:bookmarkEnd w:id="36"/>
+    <w:bookmarkEnd w:id="37"/>
     <w:sectPr>
       <w:footnotePr>
         <w:numRestart w:val="eachSect"/>

</xml_diff>

<commit_message>
Expand resume to two pages and restore original styling
</commit_message>
<xml_diff>
--- a/LawrenceDuResume.docx
+++ b/LawrenceDuResume.docx
@@ -2,7 +2,7 @@
 <file path=word/document.xml><?xml version="1.0" encoding="utf-8"?>
 <w:document xmlns:w="http://schemas.openxmlformats.org/wordprocessingml/2006/main" xmlns:m="http://schemas.openxmlformats.org/officeDocument/2006/math" xmlns:r="http://schemas.openxmlformats.org/officeDocument/2006/relationships" xmlns:o="urn:schemas-microsoft-com:office:office" xmlns:v="urn:schemas-microsoft-com:vml" xmlns:w10="urn:schemas-microsoft-com:office:word" xmlns:a="http://schemas.openxmlformats.org/drawingml/2006/main" xmlns:pic="http://schemas.openxmlformats.org/drawingml/2006/picture" xmlns:wp="http://schemas.openxmlformats.org/drawingml/2006/wordprocessingDrawing">
   <w:body>
-    <w:bookmarkStart w:id="37" w:name="_9682c7db4b1149296302af4e4041422a692422f"/>
+    <w:bookmarkStart w:id="54" w:name="_9682c7db4b1149296302af4e4041422a692422f"/>
     <w:p>
       <w:pPr>
         <w:pStyle w:val="Heading1"/>
@@ -89,7 +89,15 @@
         </w:r>
       </w:hyperlink>
     </w:p>
-    <w:bookmarkStart w:id="13" w:name="_skills"/>
+    <w:p>
+      <w:pPr>
+        <w:pStyle w:val="FirstParagraph"/>
+      </w:pPr>
+      <w:r>
+        <w:t xml:space="preserve">Machine learning engineer and biology Ph.D. with experience building scientific AI systems, distributed training platforms, and production models. Work spans sequence foundation models, computer vision, LLM applications, genomics, and experimental molecular biology.</w:t>
+      </w:r>
+    </w:p>
+    <w:bookmarkStart w:id="17" w:name="_skills"/>
     <w:p>
       <w:pPr>
         <w:pStyle w:val="Heading2"/>
@@ -98,74 +106,80 @@
         <w:t xml:space="preserve">Skills</w:t>
       </w:r>
     </w:p>
-    <w:p>
-      <w:pPr>
-        <w:pStyle w:val="FirstParagraph"/>
-      </w:pPr>
-      <w:r>
-        <w:rPr>
-          <w:b/>
-          <w:bCs/>
-        </w:rPr>
-        <w:t xml:space="preserve">Languages:</w:t>
-      </w:r>
-      <w:r>
-        <w:t xml:space="preserve"> </w:t>
-      </w:r>
+    <w:bookmarkStart w:id="13" w:name="_languages"/>
+    <w:p>
+      <w:pPr>
+        <w:pStyle w:val="Heading4"/>
+      </w:pPr>
+      <w:r>
+        <w:t xml:space="preserve">Languages</w:t>
+      </w:r>
+    </w:p>
+    <w:p>
+      <w:pPr>
+        <w:pStyle w:val="FirstParagraph"/>
+      </w:pPr>
       <w:r>
         <w:t xml:space="preserve">Python, SQL, C/C++, C#, Rust, Java, Dart, Bash, HTML/CSS, MATLAB</w:t>
       </w:r>
-      <w:r>
-        <w:br/>
-      </w:r>
-      <w:r>
-        <w:rPr>
-          <w:b/>
-          <w:bCs/>
-        </w:rPr>
-        <w:t xml:space="preserve">ML &amp; data:</w:t>
-      </w:r>
-      <w:r>
-        <w:t xml:space="preserve"> </w:t>
-      </w:r>
-      <w:r>
-        <w:t xml:space="preserve">PyTorch, TensorFlow, scikit-learn (sklearn), NumPy, pandas, Numba, Ray, MLflow, Flask</w:t>
-      </w:r>
-      <w:r>
-        <w:br/>
-      </w:r>
-      <w:r>
-        <w:rPr>
-          <w:b/>
-          <w:bCs/>
-        </w:rPr>
-        <w:t xml:space="preserve">Cloud/MLOps:</w:t>
-      </w:r>
-      <w:r>
-        <w:t xml:space="preserve"> </w:t>
-      </w:r>
-      <w:r>
-        <w:t xml:space="preserve">Amazon Web Services (AWS), Google Cloud Platform (GCP), Kubernetes, Docker, Terraform, Pulumi, Metaflow</w:t>
-      </w:r>
-      <w:r>
-        <w:br/>
-      </w:r>
-      <w:r>
-        <w:rPr>
-          <w:b/>
-          <w:bCs/>
-        </w:rPr>
-        <w:t xml:space="preserve">ML &amp; scientific computing:</w:t>
-      </w:r>
-      <w:r>
-        <w:t xml:space="preserve"> </w:t>
-      </w:r>
-      <w:r>
-        <w:t xml:space="preserve">Foundation model fine-tuning, deep learning, transformers, convolutional neural networks (CNNs), graph neural networks (GNNs), diffusion, Louvain/Leiden community detection, SVM, PCA, KNN, decision trees</w:t>
-      </w:r>
     </w:p>
     <w:bookmarkEnd w:id="13"/>
-    <w:bookmarkStart w:id="31" w:name="_experience"/>
+    <w:bookmarkStart w:id="14" w:name="_4172ea3214963054a0d0bc65a67a59934a4a290"/>
+    <w:p>
+      <w:pPr>
+        <w:pStyle w:val="Heading4"/>
+      </w:pPr>
+      <w:r>
+        <w:t xml:space="preserve">ML and data tools</w:t>
+      </w:r>
+    </w:p>
+    <w:p>
+      <w:pPr>
+        <w:pStyle w:val="FirstParagraph"/>
+      </w:pPr>
+      <w:r>
+        <w:t xml:space="preserve">PyTorch, TensorFlow, JAX, scikit-learn (sklearn), NumPy, SciPy, pandas, Numba, Ray, MLflow, Flask, Jupyter</w:t>
+      </w:r>
+    </w:p>
+    <w:bookmarkEnd w:id="14"/>
+    <w:bookmarkStart w:id="15" w:name="_e050a77dc03158d346a856e1214f3a30302e0fc"/>
+    <w:p>
+      <w:pPr>
+        <w:pStyle w:val="Heading4"/>
+      </w:pPr>
+      <w:r>
+        <w:t xml:space="preserve">Cloud and MLOps</w:t>
+      </w:r>
+    </w:p>
+    <w:p>
+      <w:pPr>
+        <w:pStyle w:val="FirstParagraph"/>
+      </w:pPr>
+      <w:r>
+        <w:t xml:space="preserve">Amazon Web Services (AWS: EC2, S3, Batch, Glue, Athena, Fargate), Google Cloud Platform (GCP), Kubernetes, Docker, Terraform, Pulumi, Metaflow, Jenkins, Linux</w:t>
+      </w:r>
+    </w:p>
+    <w:bookmarkEnd w:id="15"/>
+    <w:bookmarkStart w:id="16" w:name="_2f40e396a96bd75e83bf646a2f51fdeb02c03d4"/>
+    <w:p>
+      <w:pPr>
+        <w:pStyle w:val="Heading4"/>
+      </w:pPr>
+      <w:r>
+        <w:t xml:space="preserve">ML and scientific computing</w:t>
+      </w:r>
+    </w:p>
+    <w:p>
+      <w:pPr>
+        <w:pStyle w:val="FirstParagraph"/>
+      </w:pPr>
+      <w:r>
+        <w:t xml:space="preserve">Foundation model fine-tuning, deep learning, transformers, convolutional neural networks (CNNs), graph neural networks (GNNs), generative adversarial networks (GANs), diffusion, Louvain/Leiden community detection, SVM, PCA, KNN, decision trees, cross-validation</w:t>
+      </w:r>
+    </w:p>
+    <w:bookmarkEnd w:id="16"/>
+    <w:bookmarkEnd w:id="17"/>
+    <w:bookmarkStart w:id="42" w:name="_experience"/>
     <w:p>
       <w:pPr>
         <w:pStyle w:val="Heading2"/>
@@ -174,12 +188,12 @@
         <w:t xml:space="preserve">Experience</w:t>
       </w:r>
     </w:p>
-    <w:bookmarkStart w:id="16" w:name="_dcc5a053e1bcdfd5ff2a6425066a825e929a4b5"/>
-    <w:p>
-      <w:pPr>
-        <w:pStyle w:val="Heading4"/>
-      </w:pPr>
-      <w:hyperlink r:id="rId14">
+    <w:bookmarkStart w:id="20" w:name="_dcc5a053e1bcdfd5ff2a6425066a825e929a4b5"/>
+    <w:p>
+      <w:pPr>
+        <w:pStyle w:val="Heading3"/>
+      </w:pPr>
+      <w:hyperlink r:id="rId18">
         <w:r>
           <w:rPr>
             <w:rStyle w:val="Hyperlink"/>
@@ -194,7 +208,7 @@
         <w:t xml:space="preserve">• Senior AI/ML Engineer, Sequence Learning and Phenomics</w:t>
       </w:r>
     </w:p>
-    <w:bookmarkStart w:id="15" w:name="_3a525e7ac7973c43e29d649fc78f101dcff82e4"/>
+    <w:bookmarkStart w:id="19" w:name="_3a525e7ac7973c43e29d649fc78f101dcff82e4"/>
     <w:p>
       <w:pPr>
         <w:pStyle w:val="Heading5"/>
@@ -205,14 +219,14 @@
     </w:p>
     <w:p>
       <w:pPr>
-        <w:pStyle w:val="Compact"/>
+        <w:pStyle w:val="FirstParagraph"/>
         <w:numPr>
           <w:ilvl w:val="0"/>
           <w:numId w:val="1001"/>
         </w:numPr>
       </w:pPr>
       <w:r>
-        <w:t xml:space="preserve">Built a sequence foundation model fine-tuning platform for RNA properties and single-cell RNA-seq perturbation prediction; cut iteration time</w:t>
+        <w:t xml:space="preserve">Built an end-to-end fine-tuning platform for sequence foundation models, enabling internal teams to predict RNA properties from nucleotide sequences and perturbation responses from single-cell RNA-seq. Cut iteration time</w:t>
       </w:r>
       <w:r>
         <w:t xml:space="preserve"> </w:t>
@@ -230,14 +244,14 @@
     </w:p>
     <w:p>
       <w:pPr>
-        <w:pStyle w:val="Compact"/>
+        <w:pStyle w:val="FirstParagraph"/>
         <w:numPr>
           <w:ilvl w:val="0"/>
           <w:numId w:val="1001"/>
         </w:numPr>
       </w:pPr>
       <w:r>
-        <w:t xml:space="preserve">Integrated Segment Anything Model (SAM) image segmentation into production computer vision and embedding pipelines for single-cell tracking and cell-state world modeling across</w:t>
+        <w:t xml:space="preserve">Integrated Segment Anything Model (SAM) image segmentation into production computer vision and image-embedding pipelines, enabling single-cell tracking and cell-state world modeling across</w:t>
       </w:r>
       <w:r>
         <w:t xml:space="preserve"> </w:t>
@@ -255,14 +269,14 @@
     </w:p>
     <w:p>
       <w:pPr>
-        <w:pStyle w:val="Compact"/>
+        <w:pStyle w:val="FirstParagraph"/>
         <w:numPr>
           <w:ilvl w:val="0"/>
           <w:numId w:val="1001"/>
         </w:numPr>
       </w:pPr>
       <w:r>
-        <w:t xml:space="preserve">Designed embedding-based differentiation QC for</w:t>
+        <w:t xml:space="preserve">Designed embedding-based differentiation quality control (QC) that scored</w:t>
       </w:r>
       <w:r>
         <w:t xml:space="preserve"> </w:t>
@@ -275,34 +289,31 @@
         <w:t xml:space="preserve">&gt;3 million iPSC-to-microglia cells</w:t>
       </w:r>
       <w:r>
-        <w:t xml:space="preserve"> </w:t>
-      </w:r>
-      <w:r>
-        <w:t xml:space="preserve">in Alzheimer’s research.</w:t>
-      </w:r>
-    </w:p>
-    <w:p>
-      <w:pPr>
-        <w:pStyle w:val="Compact"/>
+        <w:t xml:space="preserve">, supporting active Alzheimer’s disease research.</w:t>
+      </w:r>
+    </w:p>
+    <w:p>
+      <w:pPr>
+        <w:pStyle w:val="FirstParagraph"/>
         <w:numPr>
           <w:ilvl w:val="0"/>
           <w:numId w:val="1001"/>
         </w:numPr>
       </w:pPr>
       <w:r>
-        <w:t xml:space="preserve">Piloted generative AI for protein subcellular localization images: x-prediction / JiT diffusion using ESM protein embeddings.</w:t>
-      </w:r>
-    </w:p>
-    <w:p>
-      <w:pPr>
-        <w:pStyle w:val="Compact"/>
+        <w:t xml:space="preserve">Piloted generative AI using x-prediction / JiT diffusion models to generate protein subcellular localization images conditioned on ESM protein embeddings.</w:t>
+      </w:r>
+    </w:p>
+    <w:p>
+      <w:pPr>
+        <w:pStyle w:val="FirstParagraph"/>
         <w:numPr>
           <w:ilvl w:val="0"/>
           <w:numId w:val="1001"/>
         </w:numPr>
       </w:pPr>
       <w:r>
-        <w:t xml:space="preserve">Built a pipeline using large language models (LLMs) for retrieval-augmented generation (RAG) and gene-candidate evaluation; prioritized</w:t>
+        <w:t xml:space="preserve">Built a pipeline using large language models (LLMs) for retrieval-augmented generation (RAG) and gene-candidate evaluation. Prioritized</w:t>
       </w:r>
       <w:r>
         <w:t xml:space="preserve"> </w:t>
@@ -312,25 +323,25 @@
           <w:b/>
           <w:bCs/>
         </w:rPr>
-        <w:t xml:space="preserve">~1,000 genes</w:t>
-      </w:r>
-      <w:r>
-        <w:t xml:space="preserve"> </w:t>
-      </w:r>
-      <w:r>
-        <w:t xml:space="preserve">for a lung-epithelium CRISPR knockout screen supporting a COPD drug program.</w:t>
-      </w:r>
-    </w:p>
-    <w:p>
-      <w:pPr>
-        <w:pStyle w:val="Compact"/>
+        <w:t xml:space="preserve">~1,000 candidate genes</w:t>
+      </w:r>
+      <w:r>
+        <w:t xml:space="preserve"> </w:t>
+      </w:r>
+      <w:r>
+        <w:t xml:space="preserve">for a lung-epithelium CRISPR knockout screen supporting a next-generation COPD drug program.</w:t>
+      </w:r>
+    </w:p>
+    <w:p>
+      <w:pPr>
+        <w:pStyle w:val="FirstParagraph"/>
         <w:numPr>
           <w:ilvl w:val="0"/>
           <w:numId w:val="1001"/>
         </w:numPr>
       </w:pPr>
       <w:r>
-        <w:t xml:space="preserve">Shipped Model Context Protocol (MCP) servers enabling company-wide LLM assistants to build and launch image-analysis pipelines; accelerated analysis turnaround</w:t>
+        <w:t xml:space="preserve">Shipped Model Context Protocol (MCP) servers that let company-wide LLM assistants build and launch scientists’ image-analysis pipelines, making internal AI Science tools agent-callable and accelerating analysis turnaround</w:t>
       </w:r>
       <w:r>
         <w:t xml:space="preserve"> </w:t>
@@ -348,24 +359,24 @@
     </w:p>
     <w:p>
       <w:pPr>
-        <w:pStyle w:val="Compact"/>
+        <w:pStyle w:val="FirstParagraph"/>
         <w:numPr>
           <w:ilvl w:val="0"/>
           <w:numId w:val="1001"/>
         </w:numPr>
       </w:pPr>
       <w:r>
-        <w:t xml:space="preserve">Conducted interviews for team hiring; contributing to LLM benchmarking currently in development.</w:t>
-      </w:r>
-    </w:p>
-    <w:bookmarkEnd w:id="15"/>
-    <w:bookmarkEnd w:id="16"/>
-    <w:bookmarkStart w:id="19" w:name="_2470f9df5c73068d7cec7dd91f48e88377ff3e7"/>
-    <w:p>
-      <w:pPr>
-        <w:pStyle w:val="Heading4"/>
-      </w:pPr>
-      <w:hyperlink r:id="rId17">
+        <w:t xml:space="preserve">Contributing to LLM benchmarking currently in development; conducted interviews to support hiring on the team.</w:t>
+      </w:r>
+    </w:p>
+    <w:bookmarkEnd w:id="19"/>
+    <w:bookmarkEnd w:id="20"/>
+    <w:bookmarkStart w:id="23" w:name="_2470f9df5c73068d7cec7dd91f48e88377ff3e7"/>
+    <w:p>
+      <w:pPr>
+        <w:pStyle w:val="Heading3"/>
+      </w:pPr>
+      <w:hyperlink r:id="rId21">
         <w:r>
           <w:rPr>
             <w:rStyle w:val="Hyperlink"/>
@@ -380,7 +391,7 @@
         <w:t xml:space="preserve">• Senior Machine Learning Research Engineer</w:t>
       </w:r>
     </w:p>
-    <w:bookmarkStart w:id="18" w:name="_a3336994878c0ad5b79f63603847d0031816c36"/>
+    <w:bookmarkStart w:id="22" w:name="_a3336994878c0ad5b79f63603847d0031816c36"/>
     <w:p>
       <w:pPr>
         <w:pStyle w:val="Heading5"/>
@@ -391,14 +402,14 @@
     </w:p>
     <w:p>
       <w:pPr>
-        <w:pStyle w:val="Compact"/>
+        <w:pStyle w:val="FirstParagraph"/>
         <w:numPr>
           <w:ilvl w:val="0"/>
           <w:numId w:val="1002"/>
         </w:numPr>
       </w:pPr>
       <w:r>
-        <w:t xml:space="preserve">Led greenfield distributed ML platform development with PyTorch, Ray, and Kubernetes for DNA methylation/protein cancer detection; accelerated model training</w:t>
+        <w:t xml:space="preserve">Led a greenfield distributed ML platform project using PyTorch, Ray, and Kubernetes for cancer detection from methylated DNA and protein data. Enabled larger models and accelerated model training</w:t>
       </w:r>
       <w:r>
         <w:t xml:space="preserve"> </w:t>
@@ -414,19 +425,19 @@
         <w:t xml:space="preserve"> </w:t>
       </w:r>
       <w:r>
-        <w:t xml:space="preserve">with distributed data parallelism (DDP).</w:t>
-      </w:r>
-    </w:p>
-    <w:p>
-      <w:pPr>
-        <w:pStyle w:val="Compact"/>
+        <w:t xml:space="preserve">using distributed data parallelism (DDP).</w:t>
+      </w:r>
+    </w:p>
+    <w:p>
+      <w:pPr>
+        <w:pStyle w:val="FirstParagraph"/>
         <w:numPr>
           <w:ilvl w:val="0"/>
           <w:numId w:val="1002"/>
         </w:numPr>
       </w:pPr>
       <w:r>
-        <w:t xml:space="preserve">Deployed organization-wide MLflow experiment tracking and automated reporting on GCP with Terraform/Pulumi; reduced manual research effort</w:t>
+        <w:t xml:space="preserve">Deployed organization-wide MLflow experiment tracking on GCP using Terraform and Pulumi. Enabled live training monitoring, results sharing, and automated reproducible reports, reducing manual researcher effort</w:t>
       </w:r>
       <w:r>
         <w:t xml:space="preserve"> </w:t>
@@ -444,14 +455,14 @@
     </w:p>
     <w:p>
       <w:pPr>
-        <w:pStyle w:val="Compact"/>
+        <w:pStyle w:val="FirstParagraph"/>
         <w:numPr>
           <w:ilvl w:val="0"/>
           <w:numId w:val="1002"/>
         </w:numPr>
       </w:pPr>
       <w:r>
-        <w:t xml:space="preserve">Built PyTorch multitask neural networks and elastic net models for colorectal cancer risk from cell-free DNA in</w:t>
+        <w:t xml:space="preserve">Built scalable multitask neural networks and elastic net models in PyTorch for colorectal cancer risk from cell-free DNA, supporting a clinical trial cohort of</w:t>
       </w:r>
       <w:r>
         <w:t xml:space="preserve"> </w:t>
@@ -461,7 +472,7 @@
           <w:b/>
           <w:bCs/>
         </w:rPr>
-        <w:t xml:space="preserve">&gt;27,000 clinical trial participants</w:t>
+        <w:t xml:space="preserve">&gt;27,000 individuals</w:t>
       </w:r>
       <w:r>
         <w:t xml:space="preserve">.</w:t>
@@ -469,24 +480,24 @@
     </w:p>
     <w:p>
       <w:pPr>
-        <w:pStyle w:val="Compact"/>
+        <w:pStyle w:val="FirstParagraph"/>
         <w:numPr>
           <w:ilvl w:val="0"/>
           <w:numId w:val="1002"/>
         </w:numPr>
       </w:pPr>
       <w:r>
-        <w:t xml:space="preserve">Piloted GPT-4 biomedical natural language processing (NLP) and fine-tuned an open-source LLM with direct preference optimization (DPO) for literature summarization and feature extraction.</w:t>
-      </w:r>
-    </w:p>
-    <w:bookmarkEnd w:id="18"/>
-    <w:bookmarkEnd w:id="19"/>
-    <w:bookmarkStart w:id="22" w:name="_c8086c25dd8d20a43e7357d334baffb08e59d7e"/>
-    <w:p>
-      <w:pPr>
-        <w:pStyle w:val="Heading4"/>
-      </w:pPr>
-      <w:hyperlink r:id="rId20">
+        <w:t xml:space="preserve">Piloted biomedical natural language processing (NLP) with GPT-4 and an open-source LLM fine-tuned using direct preference optimization (DPO). Demonstrated literature summarization and feature extraction from unstructured biomedical records.</w:t>
+      </w:r>
+    </w:p>
+    <w:bookmarkEnd w:id="22"/>
+    <w:bookmarkEnd w:id="23"/>
+    <w:bookmarkStart w:id="26" w:name="_c77c3cdf22b3b4f40361cf53490a0ad022b9e8e"/>
+    <w:p>
+      <w:pPr>
+        <w:pStyle w:val="Heading3"/>
+      </w:pPr>
+      <w:hyperlink r:id="rId24">
         <w:r>
           <w:rPr>
             <w:rStyle w:val="Hyperlink"/>
@@ -498,28 +509,126 @@
         <w:t xml:space="preserve"> </w:t>
       </w:r>
       <w:r>
-        <w:t xml:space="preserve">• Machine Learning Engineer / Data Scientist</w:t>
-      </w:r>
-    </w:p>
-    <w:bookmarkStart w:id="21" w:name="_3a42951b8c85af6d7b44ab35b68269338f751e9"/>
+        <w:t xml:space="preserve">• Machine Learning Engineer</w:t>
+      </w:r>
+    </w:p>
+    <w:bookmarkStart w:id="25" w:name="_ff7e09be4b3df37f494f3cb3965eb3a575ef17b"/>
     <w:p>
       <w:pPr>
         <w:pStyle w:val="Heading5"/>
       </w:pPr>
       <w:r>
-        <w:t xml:space="preserve">Nov 2018 – Aug 2022 | Sunnyvale, CA | Data Scientist prior to 2020</w:t>
-      </w:r>
-    </w:p>
-    <w:p>
-      <w:pPr>
-        <w:pStyle w:val="Compact"/>
+        <w:t xml:space="preserve">Apr 2020 – Aug 2022 | Sunnyvale, CA</w:t>
+      </w:r>
+    </w:p>
+    <w:p>
+      <w:pPr>
+        <w:pStyle w:val="FirstParagraph"/>
         <w:numPr>
           <w:ilvl w:val="0"/>
           <w:numId w:val="1003"/>
         </w:numPr>
       </w:pPr>
       <w:r>
-        <w:t xml:space="preserve">Deployed Recent Ancestor Locations (RAL) country matching for</w:t>
+        <w:t xml:space="preserve">Built large-scale data pipelines for quality statistics and feature engineering of genotyped and imputed single-nucleotide polymorphisms (SNPs). Implemented extract, transform, load (ETL) workflows for</w:t>
+      </w:r>
+      <w:r>
+        <w:t xml:space="preserve"> </w:t>
+      </w:r>
+      <w:r>
+        <w:rPr>
+          <w:b/>
+          <w:bCs/>
+        </w:rPr>
+        <w:t xml:space="preserve">~10 million samples × ~1 million SNPs</w:t>
+      </w:r>
+      <w:r>
+        <w:t xml:space="preserve"> </w:t>
+      </w:r>
+      <w:r>
+        <w:t xml:space="preserve">using AWS Batch, Metaflow, and Glue, populating an Athena feature datastore for genome-wide association studies (GWAS) and polygenic risk scores (PRS).</w:t>
+      </w:r>
+    </w:p>
+    <w:p>
+      <w:pPr>
+        <w:pStyle w:val="FirstParagraph"/>
+        <w:numPr>
+          <w:ilvl w:val="0"/>
+          <w:numId w:val="1003"/>
+        </w:numPr>
+      </w:pPr>
+      <w:r>
+        <w:t xml:space="preserve">Improved type 2 diabetes and coronary artery disease PRS models through stacking ensembles in production pipelines. Improved sensitivity and specificity for</w:t>
+      </w:r>
+      <w:r>
+        <w:t xml:space="preserve"> </w:t>
+      </w:r>
+      <w:r>
+        <w:rPr>
+          <w:b/>
+          <w:bCs/>
+        </w:rPr>
+        <w:t xml:space="preserve">tens of thousands of customers</w:t>
+      </w:r>
+      <w:r>
+        <w:t xml:space="preserve">, evaluating models using area under the ROC curve (AUC) and precision-recall curve (auPRC) metrics.</w:t>
+      </w:r>
+    </w:p>
+    <w:p>
+      <w:pPr>
+        <w:pStyle w:val="FirstParagraph"/>
+        <w:numPr>
+          <w:ilvl w:val="0"/>
+          <w:numId w:val="1003"/>
+        </w:numPr>
+      </w:pPr>
+      <w:r>
+        <w:t xml:space="preserve">Automated model evaluation and classifier reports with MLflow artifact storage and headless Jupyter execution, reducing researcher analysis time</w:t>
+      </w:r>
+      <w:r>
+        <w:t xml:space="preserve"> </w:t>
+      </w:r>
+      <w:r>
+        <w:rPr>
+          <w:b/>
+          <w:bCs/>
+        </w:rPr>
+        <w:t xml:space="preserve">from days to minutes</w:t>
+      </w:r>
+      <w:r>
+        <w:t xml:space="preserve">.</w:t>
+      </w:r>
+    </w:p>
+    <w:bookmarkEnd w:id="25"/>
+    <w:bookmarkEnd w:id="26"/>
+    <w:bookmarkStart w:id="28" w:name="_865699a62172e282011d0143d7a1646e8335f9a"/>
+    <w:p>
+      <w:pPr>
+        <w:pStyle w:val="Heading3"/>
+      </w:pPr>
+      <w:r>
+        <w:t xml:space="preserve">23andMe • Data Scientist, Ancestry Product</w:t>
+      </w:r>
+    </w:p>
+    <w:bookmarkStart w:id="27" w:name="_a0fdeee4e29474480969f1191725ea9b8c1b4ed"/>
+    <w:p>
+      <w:pPr>
+        <w:pStyle w:val="Heading5"/>
+      </w:pPr>
+      <w:r>
+        <w:t xml:space="preserve">Nov 2018 – Apr 2020 | Sunnyvale, CA</w:t>
+      </w:r>
+    </w:p>
+    <w:p>
+      <w:pPr>
+        <w:pStyle w:val="FirstParagraph"/>
+        <w:numPr>
+          <w:ilvl w:val="0"/>
+          <w:numId w:val="1004"/>
+        </w:numPr>
+      </w:pPr>
+      <w:r>
+        <w:t xml:space="preserve">Created and deployed Recent Ancestor Locations (RAL), a high-precision, high-recall country-matching algorithm serving</w:t>
       </w:r>
       <w:r>
         <w:t xml:space="preserve"> </w:t>
@@ -532,64 +641,32 @@
         <w:t xml:space="preserve">&gt;15 million customers</w:t>
       </w:r>
       <w:r>
-        <w:t xml:space="preserve">; used identity-by-descent (IBD) graphs and community detection to identify genetic subpopulations.</w:t>
-      </w:r>
-    </w:p>
-    <w:p>
-      <w:pPr>
-        <w:pStyle w:val="Compact"/>
-        <w:numPr>
-          <w:ilvl w:val="0"/>
-          <w:numId w:val="1003"/>
-        </w:numPr>
-      </w:pPr>
-      <w:r>
-        <w:t xml:space="preserve">Built large-scale data pipelines for SNP feature engineering and ETL (</w:t>
-      </w:r>
-      <w:r>
-        <w:rPr>
-          <w:b/>
-          <w:bCs/>
-        </w:rPr>
-        <w:t xml:space="preserve">~10 million samples × ~1 million SNPs</w:t>
-      </w:r>
-      <w:r>
-        <w:t xml:space="preserve">) with AWS Batch/Glue/Athena and Metaflow; enabled genome-wide association studies (GWAS) and polygenic risk scores (PRS).</w:t>
-      </w:r>
-    </w:p>
-    <w:p>
-      <w:pPr>
-        <w:pStyle w:val="Compact"/>
-        <w:numPr>
-          <w:ilvl w:val="0"/>
-          <w:numId w:val="1003"/>
-        </w:numPr>
-      </w:pPr>
-      <w:r>
-        <w:t xml:space="preserve">Improved type 2 diabetes and coronary artery disease PRS with stacking ensembles; automated MLflow/Jupyter model evaluation, cutting analysis</w:t>
-      </w:r>
-      <w:r>
-        <w:t xml:space="preserve"> </w:t>
-      </w:r>
-      <w:r>
-        <w:rPr>
-          <w:b/>
-          <w:bCs/>
-        </w:rPr>
-        <w:t xml:space="preserve">from days to minutes</w:t>
-      </w:r>
-      <w:r>
-        <w:t xml:space="preserve">.</w:t>
-      </w:r>
-    </w:p>
-    <w:bookmarkEnd w:id="21"/>
-    <w:bookmarkEnd w:id="22"/>
-    <w:bookmarkStart w:id="24" w:name="_3db70173039e70773c59322cbf246eb4e2b86bc"/>
-    <w:p>
-      <w:pPr>
-        <w:pStyle w:val="Heading4"/>
-      </w:pPr>
-      <w:hyperlink r:id="rId23">
+        <w:t xml:space="preserve"> </w:t>
+      </w:r>
+      <w:r>
+        <w:t xml:space="preserve">worldwide. Deployed the model as an AWS Fargate microservice with MLflow artifact tracking.</w:t>
+      </w:r>
+    </w:p>
+    <w:p>
+      <w:pPr>
+        <w:pStyle w:val="FirstParagraph"/>
+        <w:numPr>
+          <w:ilvl w:val="0"/>
+          <w:numId w:val="1004"/>
+        </w:numPr>
+      </w:pPr>
+      <w:r>
+        <w:t xml:space="preserve">Improved graph-based techniques for identifying genetic populations from identity-by-descent (IBD) family relationships. Used graph community detection to identify subpopulations in Mexico and the United Kingdom.</w:t>
+      </w:r>
+    </w:p>
+    <w:bookmarkEnd w:id="27"/>
+    <w:bookmarkEnd w:id="28"/>
+    <w:bookmarkStart w:id="31" w:name="_f58706a2979db3ce43a770e11687fb9cb87b8ae"/>
+    <w:p>
+      <w:pPr>
+        <w:pStyle w:val="Heading3"/>
+      </w:pPr>
+      <w:hyperlink r:id="rId29">
         <w:r>
           <w:rPr>
             <w:rStyle w:val="Hyperlink"/>
@@ -601,24 +678,66 @@
         <w:t xml:space="preserve"> </w:t>
       </w:r>
       <w:r>
-        <w:t xml:space="preserve">• Bioinformatician IV • May 2018 – Oct 2018</w:t>
-      </w:r>
-    </w:p>
-    <w:p>
-      <w:pPr>
-        <w:pStyle w:val="FirstParagraph"/>
-      </w:pPr>
-      <w:r>
-        <w:t xml:space="preserve">Built an RNA-based transplant rejection classifier and Nanopore bioinformatics pipelines with Common Workflow Language (CWL).</w:t>
-      </w:r>
-    </w:p>
-    <w:bookmarkEnd w:id="24"/>
-    <w:bookmarkStart w:id="27" w:name="_144acba540e57d4ad1832463e0a3604fd377ad2"/>
-    <w:p>
-      <w:pPr>
-        <w:pStyle w:val="Heading4"/>
-      </w:pPr>
-      <w:hyperlink r:id="rId25">
+        <w:t xml:space="preserve">• Bioinformatician IV</w:t>
+      </w:r>
+    </w:p>
+    <w:bookmarkStart w:id="30" w:name="_19757c96fc6fc0ef1edefe5c09f80a60d696f5f"/>
+    <w:p>
+      <w:pPr>
+        <w:pStyle w:val="Heading5"/>
+      </w:pPr>
+      <w:r>
+        <w:t xml:space="preserve">May 2018 – Oct 2018 | San Diego, CA</w:t>
+      </w:r>
+    </w:p>
+    <w:p>
+      <w:pPr>
+        <w:pStyle w:val="FirstParagraph"/>
+        <w:numPr>
+          <w:ilvl w:val="0"/>
+          <w:numId w:val="1005"/>
+        </w:numPr>
+      </w:pPr>
+      <w:r>
+        <w:t xml:space="preserve">Developed an organ transplant rejection classifier from RNA sequencing data for a research grant.</w:t>
+      </w:r>
+    </w:p>
+    <w:p>
+      <w:pPr>
+        <w:pStyle w:val="FirstParagraph"/>
+        <w:numPr>
+          <w:ilvl w:val="0"/>
+          <w:numId w:val="1005"/>
+        </w:numPr>
+      </w:pPr>
+      <w:r>
+        <w:t xml:space="preserve">Built automated Oxford Nanopore long-read bioinformatics pipelines in Common Workflow Language (CWL) for real-time microbial diagnostics,</w:t>
+      </w:r>
+      <w:r>
+        <w:t xml:space="preserve"> </w:t>
+      </w:r>
+      <w:r>
+        <w:rPr>
+          <w:i/>
+          <w:iCs/>
+        </w:rPr>
+        <w:t xml:space="preserve">de novo</w:t>
+      </w:r>
+      <w:r>
+        <w:t xml:space="preserve"> </w:t>
+      </w:r>
+      <w:r>
+        <w:t xml:space="preserve">genome assembly, and variant calling.</w:t>
+      </w:r>
+    </w:p>
+    <w:bookmarkEnd w:id="30"/>
+    <w:bookmarkEnd w:id="31"/>
+    <w:bookmarkStart w:id="34" w:name="_585b308482c8fa20892f128c8222f0a786707a7"/>
+    <w:p>
+      <w:pPr>
+        <w:pStyle w:val="Heading3"/>
+      </w:pPr>
+      <w:hyperlink r:id="rId32">
         <w:r>
           <w:rPr>
             <w:rStyle w:val="Hyperlink"/>
@@ -630,20 +749,355 @@
         <w:t xml:space="preserve"> </w:t>
       </w:r>
       <w:r>
-        <w:t xml:space="preserve">• Independent Consultant • Sep 2017 – Feb 2018</w:t>
-      </w:r>
-    </w:p>
-    <w:p>
-      <w:pPr>
-        <w:pStyle w:val="FirstParagraph"/>
-      </w:pPr>
-      <w:r>
-        <w:t xml:space="preserve">Developed a TensorFlow prenatal screening classifier and co-invented</w:t>
-      </w:r>
-      <w:r>
-        <w:t xml:space="preserve"> </w:t>
-      </w:r>
-      <w:hyperlink r:id="rId26">
+        <w:t xml:space="preserve">• Independent Consultant</w:t>
+      </w:r>
+    </w:p>
+    <w:bookmarkStart w:id="33" w:name="_fdb12ef2dad10e2ac5fcb437c0b472c572861b2"/>
+    <w:p>
+      <w:pPr>
+        <w:pStyle w:val="Heading5"/>
+      </w:pPr>
+      <w:r>
+        <w:t xml:space="preserve">Sep 2017 – Feb 2018 | San Diego, CA</w:t>
+      </w:r>
+    </w:p>
+    <w:p>
+      <w:pPr>
+        <w:pStyle w:val="FirstParagraph"/>
+        <w:numPr>
+          <w:ilvl w:val="0"/>
+          <w:numId w:val="1006"/>
+        </w:numPr>
+      </w:pPr>
+      <w:r>
+        <w:t xml:space="preserve">Developed a TensorFlow deep learning software package for detecting prenatal genetic abnormalities from high-throughput sequencing data; co-invented a patent for deep learning-based prenatal testing.</w:t>
+      </w:r>
+    </w:p>
+    <w:p>
+      <w:pPr>
+        <w:pStyle w:val="FirstParagraph"/>
+        <w:numPr>
+          <w:ilvl w:val="0"/>
+          <w:numId w:val="1006"/>
+        </w:numPr>
+      </w:pPr>
+      <w:r>
+        <w:t xml:space="preserve">Created a genetic-abnormality simulator derived from statistical analysis of human high-throughput sequencing data.</w:t>
+      </w:r>
+    </w:p>
+    <w:bookmarkEnd w:id="33"/>
+    <w:bookmarkEnd w:id="34"/>
+    <w:bookmarkStart w:id="38" w:name="_00cc2e98a6876513d8f0379435c3e60f96d694e"/>
+    <w:p>
+      <w:pPr>
+        <w:pStyle w:val="Heading3"/>
+      </w:pPr>
+      <w:hyperlink r:id="rId35">
+        <w:r>
+          <w:rPr>
+            <w:rStyle w:val="Hyperlink"/>
+          </w:rPr>
+          <w:t xml:space="preserve">Insight</w:t>
+        </w:r>
+      </w:hyperlink>
+      <w:r>
+        <w:t xml:space="preserve"> </w:t>
+      </w:r>
+      <w:r>
+        <w:t xml:space="preserve">• Data Science Fellow</w:t>
+      </w:r>
+    </w:p>
+    <w:bookmarkStart w:id="37" w:name="_40a22e2e113a7a4b54f7c04c2e9598ce234b55c"/>
+    <w:p>
+      <w:pPr>
+        <w:pStyle w:val="Heading5"/>
+      </w:pPr>
+      <w:r>
+        <w:t xml:space="preserve">Jan 2017 – Apr 2017 | Remote / San Diego, CA</w:t>
+      </w:r>
+    </w:p>
+    <w:p>
+      <w:pPr>
+        <w:pStyle w:val="Compact"/>
+        <w:numPr>
+          <w:ilvl w:val="0"/>
+          <w:numId w:val="1007"/>
+        </w:numPr>
+      </w:pPr>
+      <w:r>
+        <w:t xml:space="preserve">Built</w:t>
+      </w:r>
+      <w:r>
+        <w:t xml:space="preserve"> </w:t>
+      </w:r>
+      <w:hyperlink r:id="rId36">
+        <w:r>
+          <w:rPr>
+            <w:rStyle w:val="Hyperlink"/>
+          </w:rPr>
+          <w:t xml:space="preserve">DeepPixelMonster</w:t>
+        </w:r>
+      </w:hyperlink>
+      <w:r>
+        <w:t xml:space="preserve">, a TensorFlow deep convolutional generative adversarial network (DCGAN) for pixel art, and deployed it as an interactive Flask application on AWS EC2.</w:t>
+      </w:r>
+    </w:p>
+    <w:bookmarkEnd w:id="37"/>
+    <w:bookmarkEnd w:id="38"/>
+    <w:bookmarkStart w:id="41" w:name="_360c1a00ccdbf2b988d72704a44a68ea4861e0e"/>
+    <w:p>
+      <w:pPr>
+        <w:pStyle w:val="Heading3"/>
+      </w:pPr>
+      <w:r>
+        <w:t xml:space="preserve">UC San Diego • Ph.D. Researcher, Biology • Scott A. Rifkin Lab</w:t>
+      </w:r>
+    </w:p>
+    <w:bookmarkStart w:id="40" w:name="_67d445d10ad2c7be67b774a513e894abcd99f6f"/>
+    <w:p>
+      <w:pPr>
+        <w:pStyle w:val="Heading5"/>
+      </w:pPr>
+      <w:r>
+        <w:t xml:space="preserve">Aug 2010 – May 2017 | La Jolla, CA</w:t>
+      </w:r>
+    </w:p>
+    <w:p>
+      <w:pPr>
+        <w:pStyle w:val="FirstParagraph"/>
+        <w:numPr>
+          <w:ilvl w:val="0"/>
+          <w:numId w:val="1008"/>
+        </w:numPr>
+      </w:pPr>
+      <w:r>
+        <w:t xml:space="preserve">Built</w:t>
+      </w:r>
+      <w:r>
+        <w:t xml:space="preserve"> </w:t>
+      </w:r>
+      <w:hyperlink r:id="rId39">
+        <w:r>
+          <w:rPr>
+            <w:rStyle w:val="Hyperlink"/>
+          </w:rPr>
+          <w:t xml:space="preserve">DeepNuc</w:t>
+        </w:r>
+      </w:hyperlink>
+      <w:r>
+        <w:t xml:space="preserve">, a CNN for classifying</w:t>
+      </w:r>
+      <w:r>
+        <w:t xml:space="preserve"> </w:t>
+      </w:r>
+      <w:r>
+        <w:rPr>
+          <w:b/>
+          <w:bCs/>
+        </w:rPr>
+        <w:t xml:space="preserve">&gt;500,000</w:t>
+      </w:r>
+      <w:r>
+        <w:t xml:space="preserve"> </w:t>
+      </w:r>
+      <w:r>
+        <w:t xml:space="preserve">transcription start site (TSS) flanking sequences from humans, mice, fruit flies, and nematodes, plus</w:t>
+      </w:r>
+      <w:r>
+        <w:t xml:space="preserve"> </w:t>
+      </w:r>
+      <w:r>
+        <w:rPr>
+          <w:b/>
+          <w:bCs/>
+        </w:rPr>
+        <w:t xml:space="preserve">&gt;60,000</w:t>
+      </w:r>
+      <w:r>
+        <w:t xml:space="preserve"> </w:t>
+      </w:r>
+      <w:r>
+        <w:t xml:space="preserve">microRNA target sequences from publicly available CLEAR-CLIP data.</w:t>
+      </w:r>
+    </w:p>
+    <w:p>
+      <w:pPr>
+        <w:pStyle w:val="FirstParagraph"/>
+        <w:numPr>
+          <w:ilvl w:val="0"/>
+          <w:numId w:val="1008"/>
+        </w:numPr>
+      </w:pPr>
+      <w:r>
+        <w:t xml:space="preserve">Studied developmental RNA expression noise in</w:t>
+      </w:r>
+      <w:r>
+        <w:t xml:space="preserve"> </w:t>
+      </w:r>
+      <w:r>
+        <w:rPr>
+          <w:b/>
+          <w:bCs/>
+        </w:rPr>
+        <w:t xml:space="preserve">&gt;5,000 embryos</w:t>
+      </w:r>
+      <w:r>
+        <w:t xml:space="preserve"> </w:t>
+      </w:r>
+      <w:r>
+        <w:t xml:space="preserve">using single-molecule imaging and custom MATLAB tools for image segmentation, fluorescence quantification, and deconvolution.</w:t>
+      </w:r>
+    </w:p>
+    <w:p>
+      <w:pPr>
+        <w:pStyle w:val="FirstParagraph"/>
+        <w:numPr>
+          <w:ilvl w:val="0"/>
+          <w:numId w:val="1008"/>
+        </w:numPr>
+      </w:pPr>
+      <w:r>
+        <w:t xml:space="preserve">Generated</w:t>
+      </w:r>
+      <w:r>
+        <w:t xml:space="preserve"> </w:t>
+      </w:r>
+      <w:r>
+        <w:rPr>
+          <w:b/>
+          <w:bCs/>
+        </w:rPr>
+        <w:t xml:space="preserve">&gt;70 transgenic nematode and Drosophila strains</w:t>
+      </w:r>
+      <w:r>
+        <w:t xml:space="preserve"> </w:t>
+      </w:r>
+      <w:r>
+        <w:t xml:space="preserve">using Gibson assembly, CRISPR/Cas9, MosSCI, and PhiC31 integrase.</w:t>
+      </w:r>
+    </w:p>
+    <w:bookmarkEnd w:id="40"/>
+    <w:bookmarkEnd w:id="41"/>
+    <w:bookmarkEnd w:id="42"/>
+    <w:bookmarkStart w:id="45" w:name="_education"/>
+    <w:p>
+      <w:pPr>
+        <w:pStyle w:val="Heading2"/>
+      </w:pPr>
+      <w:r>
+        <w:t xml:space="preserve">Education</w:t>
+      </w:r>
+    </w:p>
+    <w:bookmarkStart w:id="43" w:name="_03ca403baa4002891dcf4418164c0d1378efafd"/>
+    <w:p>
+      <w:pPr>
+        <w:pStyle w:val="Heading4"/>
+      </w:pPr>
+      <w:r>
+        <w:t xml:space="preserve">Ph.D., Biology • UC San Diego</w:t>
+      </w:r>
+    </w:p>
+    <w:p>
+      <w:pPr>
+        <w:pStyle w:val="FirstParagraph"/>
+      </w:pPr>
+      <w:r>
+        <w:t xml:space="preserve">2010–2017 • Scott A. Rifkin Lab</w:t>
+      </w:r>
+    </w:p>
+    <w:bookmarkEnd w:id="43"/>
+    <w:bookmarkStart w:id="44" w:name="_28b85522afeb37b0a2c01dde59d30f72700bfa9"/>
+    <w:p>
+      <w:pPr>
+        <w:pStyle w:val="Heading4"/>
+      </w:pPr>
+      <w:r>
+        <w:t xml:space="preserve">B.A., Biological Sciences • Cornell University</w:t>
+      </w:r>
+    </w:p>
+    <w:p>
+      <w:pPr>
+        <w:pStyle w:val="FirstParagraph"/>
+      </w:pPr>
+      <w:r>
+        <w:t xml:space="preserve">2006–2010 • Genetics and Development •</w:t>
+      </w:r>
+      <w:r>
+        <w:t xml:space="preserve"> </w:t>
+      </w:r>
+      <w:r>
+        <w:rPr>
+          <w:i/>
+          <w:iCs/>
+        </w:rPr>
+        <w:t xml:space="preserve">magna cum laude</w:t>
+      </w:r>
+    </w:p>
+    <w:bookmarkEnd w:id="44"/>
+    <w:bookmarkEnd w:id="45"/>
+    <w:bookmarkStart w:id="48" w:name="_d37f4d90a711ff5d4d14ef973643b4af6be8ab1"/>
+    <w:p>
+      <w:pPr>
+        <w:pStyle w:val="Heading2"/>
+      </w:pPr>
+      <w:r>
+        <w:t xml:space="preserve">Selected Publication and Patent</w:t>
+      </w:r>
+    </w:p>
+    <w:p>
+      <w:pPr>
+        <w:pStyle w:val="FirstParagraph"/>
+      </w:pPr>
+      <w:r>
+        <w:rPr>
+          <w:b/>
+          <w:bCs/>
+        </w:rPr>
+        <w:t xml:space="preserve">Du et al. (2016).</w:t>
+      </w:r>
+      <w:r>
+        <w:t xml:space="preserve"> </w:t>
+      </w:r>
+      <w:hyperlink r:id="rId46">
+        <w:r>
+          <w:rPr>
+            <w:rStyle w:val="Hyperlink"/>
+          </w:rPr>
+          <w:t xml:space="preserve">Mutagenesis of GATA motifs controlling the endoderm regulator elt-2 reveals distinct dominant and secondary cis-regulatory elements</w:t>
+        </w:r>
+      </w:hyperlink>
+      <w:r>
+        <w:t xml:space="preserve">.</w:t>
+      </w:r>
+      <w:r>
+        <w:t xml:space="preserve"> </w:t>
+      </w:r>
+      <w:r>
+        <w:rPr>
+          <w:i/>
+          <w:iCs/>
+        </w:rPr>
+        <w:t xml:space="preserve">Developmental Biology</w:t>
+      </w:r>
+      <w:r>
+        <w:t xml:space="preserve">, 412(1), 160–170.</w:t>
+      </w:r>
+    </w:p>
+    <w:p>
+      <w:pPr>
+        <w:pStyle w:val="BodyText"/>
+      </w:pPr>
+      <w:r>
+        <w:rPr>
+          <w:b/>
+          <w:bCs/>
+        </w:rPr>
+        <w:t xml:space="preserve">Co-inventor:</w:t>
+      </w:r>
+      <w:r>
+        <w:t xml:space="preserve"> </w:t>
+      </w:r>
+      <w:hyperlink r:id="rId47">
         <w:r>
           <w:rPr>
             <w:rStyle w:val="Hyperlink"/>
@@ -655,212 +1109,96 @@
         <w:t xml:space="preserve">.</w:t>
       </w:r>
     </w:p>
-    <w:bookmarkEnd w:id="27"/>
-    <w:bookmarkStart w:id="30" w:name="_2d2c5d052fcac17d5811817cc98435bc880b703"/>
+    <w:bookmarkEnd w:id="48"/>
+    <w:bookmarkStart w:id="53" w:name="_2bfd2208116bc8760116e98d98c4644648e3554"/>
+    <w:p>
+      <w:pPr>
+        <w:pStyle w:val="Heading2"/>
+      </w:pPr>
+      <w:r>
+        <w:t xml:space="preserve">Selected Projects</w:t>
+      </w:r>
+    </w:p>
+    <w:bookmarkStart w:id="50" w:name="_4e00e1c622cbd41882b11d79050c18920b5bba6"/>
     <w:p>
       <w:pPr>
         <w:pStyle w:val="Heading4"/>
       </w:pPr>
-      <w:hyperlink r:id="rId28">
+      <w:hyperlink r:id="rId49">
         <w:r>
           <w:rPr>
             <w:rStyle w:val="Hyperlink"/>
           </w:rPr>
-          <w:t xml:space="preserve">Insight</w:t>
+          <w:t xml:space="preserve">Rogue Stargun</w:t>
         </w:r>
       </w:hyperlink>
       <w:r>
         <w:t xml:space="preserve"> </w:t>
       </w:r>
       <w:r>
-        <w:t xml:space="preserve">• Data Science Fellow • Jan 2017 – Apr 2017</w:t>
-      </w:r>
-    </w:p>
-    <w:p>
-      <w:pPr>
-        <w:pStyle w:val="FirstParagraph"/>
-      </w:pPr>
-      <w:r>
-        <w:t xml:space="preserve">Built</w:t>
-      </w:r>
-      <w:r>
-        <w:t xml:space="preserve"> </w:t>
-      </w:r>
-      <w:hyperlink r:id="rId29">
+        <w:t xml:space="preserve">• Unity / C# VR space simulator</w:t>
+      </w:r>
+    </w:p>
+    <w:p>
+      <w:pPr>
+        <w:pStyle w:val="FirstParagraph"/>
+        <w:numPr>
+          <w:ilvl w:val="0"/>
+          <w:numId w:val="1009"/>
+        </w:numPr>
+      </w:pPr>
+      <w:r>
+        <w:t xml:space="preserve">Built spaceship controllers, collision avoidance and firing prediction algorithms, and behavior trees for AI flight planning and decision making.</w:t>
+      </w:r>
+    </w:p>
+    <w:p>
+      <w:pPr>
+        <w:pStyle w:val="FirstParagraph"/>
+        <w:numPr>
+          <w:ilvl w:val="0"/>
+          <w:numId w:val="1009"/>
+        </w:numPr>
+      </w:pPr>
+      <w:r>
+        <w:t xml:space="preserve">Integrated text-to-speech services from Google Cloud, Microsoft Azure, and ElevenLabs into the Unity editor to prototype campaign dialogue; built procedural mission and powerup generation.</w:t>
+      </w:r>
+    </w:p>
+    <w:p>
+      <w:pPr>
+        <w:pStyle w:val="FirstParagraph"/>
+        <w:numPr>
+          <w:ilvl w:val="0"/>
+          <w:numId w:val="1009"/>
+        </w:numPr>
+      </w:pPr>
+      <w:r>
+        <w:t xml:space="preserve">Optimized shaders and rendering/batch calls for constrained VR hardware, achieving</w:t>
+      </w:r>
+      <w:r>
+        <w:t xml:space="preserve"> </w:t>
+      </w:r>
+      <w:r>
+        <w:rPr>
+          <w:b/>
+          <w:bCs/>
+        </w:rPr>
+        <w:t xml:space="preserve">72 FPS on Meta Quest 2 and 90 FPS on Meta Quest 3</w:t>
+      </w:r>
+      <w:r>
+        <w:t xml:space="preserve">.</w:t>
+      </w:r>
+    </w:p>
+    <w:bookmarkEnd w:id="50"/>
+    <w:bookmarkStart w:id="52" w:name="_18cd080fed0f2379a5cbd48c3dda356cfcb3c18"/>
+    <w:p>
+      <w:pPr>
+        <w:pStyle w:val="Heading4"/>
+      </w:pPr>
+      <w:hyperlink r:id="rId51">
         <w:r>
           <w:rPr>
             <w:rStyle w:val="Hyperlink"/>
           </w:rPr>
-          <w:t xml:space="preserve">DeepPixelMonster</w:t>
-        </w:r>
-      </w:hyperlink>
-      <w:r>
-        <w:t xml:space="preserve">, a TensorFlow generative adversarial network (GAN) for pixel art; deployed with Flask on AWS EC2.</w:t>
-      </w:r>
-    </w:p>
-    <w:bookmarkEnd w:id="30"/>
-    <w:bookmarkEnd w:id="31"/>
-    <w:bookmarkStart w:id="33" w:name="_education"/>
-    <w:p>
-      <w:pPr>
-        <w:pStyle w:val="Heading2"/>
-      </w:pPr>
-      <w:r>
-        <w:t xml:space="preserve">Education</w:t>
-      </w:r>
-    </w:p>
-    <w:p>
-      <w:pPr>
-        <w:pStyle w:val="FirstParagraph"/>
-      </w:pPr>
-      <w:r>
-        <w:rPr>
-          <w:b/>
-          <w:bCs/>
-        </w:rPr>
-        <w:t xml:space="preserve">Ph.D., Biology</w:t>
-      </w:r>
-      <w:r>
-        <w:t xml:space="preserve"> </w:t>
-      </w:r>
-      <w:r>
-        <w:t xml:space="preserve">• UC San Diego • 2010–2017 • Scott A. Rifkin Lab</w:t>
-      </w:r>
-      <w:r>
-        <w:br/>
-      </w:r>
-      <w:r>
-        <w:t xml:space="preserve">Research:</w:t>
-      </w:r>
-      <w:r>
-        <w:t xml:space="preserve"> </w:t>
-      </w:r>
-      <w:hyperlink r:id="rId32">
-        <w:r>
-          <w:rPr>
-            <w:rStyle w:val="Hyperlink"/>
-          </w:rPr>
-          <w:t xml:space="preserve">DeepNuc</w:t>
-        </w:r>
-      </w:hyperlink>
-      <w:r>
-        <w:t xml:space="preserve"> </w:t>
-      </w:r>
-      <w:r>
-        <w:t xml:space="preserve">CNNs for</w:t>
-      </w:r>
-      <w:r>
-        <w:t xml:space="preserve"> </w:t>
-      </w:r>
-      <w:r>
-        <w:rPr>
-          <w:b/>
-          <w:bCs/>
-        </w:rPr>
-        <w:t xml:space="preserve">&gt;500,000</w:t>
-      </w:r>
-      <w:r>
-        <w:t xml:space="preserve"> </w:t>
-      </w:r>
-      <w:r>
-        <w:t xml:space="preserve">transcription start site and</w:t>
-      </w:r>
-      <w:r>
-        <w:t xml:space="preserve"> </w:t>
-      </w:r>
-      <w:r>
-        <w:rPr>
-          <w:b/>
-          <w:bCs/>
-        </w:rPr>
-        <w:t xml:space="preserve">&gt;60,000</w:t>
-      </w:r>
-      <w:r>
-        <w:t xml:space="preserve"> </w:t>
-      </w:r>
-      <w:r>
-        <w:t xml:space="preserve">microRNA target sequences; MATLAB image segmentation, fluorescence quantification, and deconvolution of RNA expression in</w:t>
-      </w:r>
-      <w:r>
-        <w:t xml:space="preserve"> </w:t>
-      </w:r>
-      <w:r>
-        <w:rPr>
-          <w:b/>
-          <w:bCs/>
-        </w:rPr>
-        <w:t xml:space="preserve">&gt;5,000 embryos</w:t>
-      </w:r>
-      <w:r>
-        <w:t xml:space="preserve">.</w:t>
-      </w:r>
-      <w:r>
-        <w:br/>
-      </w:r>
-      <w:r>
-        <w:rPr>
-          <w:b/>
-          <w:bCs/>
-        </w:rPr>
-        <w:t xml:space="preserve">B.A., Biological Sciences</w:t>
-      </w:r>
-      <w:r>
-        <w:t xml:space="preserve"> </w:t>
-      </w:r>
-      <w:r>
-        <w:t xml:space="preserve">• Cornell University • 2006–2010 • Genetics and Development,</w:t>
-      </w:r>
-      <w:r>
-        <w:t xml:space="preserve"> </w:t>
-      </w:r>
-      <w:r>
-        <w:rPr>
-          <w:i/>
-          <w:iCs/>
-        </w:rPr>
-        <w:t xml:space="preserve">magna cum laude</w:t>
-      </w:r>
-    </w:p>
-    <w:bookmarkEnd w:id="33"/>
-    <w:bookmarkStart w:id="36" w:name="_2bfd2208116bc8760116e98d98c4644648e3554"/>
-    <w:p>
-      <w:pPr>
-        <w:pStyle w:val="Heading2"/>
-      </w:pPr>
-      <w:r>
-        <w:t xml:space="preserve">Selected Projects</w:t>
-      </w:r>
-    </w:p>
-    <w:p>
-      <w:pPr>
-        <w:pStyle w:val="FirstParagraph"/>
-      </w:pPr>
-      <w:hyperlink r:id="rId34">
-        <w:r>
-          <w:rPr>
-            <w:rStyle w:val="Hyperlink"/>
-            <w:b/>
-            <w:bCs/>
-          </w:rPr>
-          <w:t xml:space="preserve">Rogue Stargun</w:t>
-        </w:r>
-      </w:hyperlink>
-      <w:r>
-        <w:t xml:space="preserve"> </w:t>
-      </w:r>
-      <w:r>
-        <w:t xml:space="preserve">— Unity/C# VR space simulator; behavior trees, AI flight planning, procedural missions, text-to-speech.</w:t>
-      </w:r>
-      <w:r>
-        <w:br/>
-      </w:r>
-      <w:hyperlink r:id="rId35">
-        <w:r>
-          <w:rPr>
-            <w:rStyle w:val="Hyperlink"/>
-            <w:b/>
-            <w:bCs/>
-          </w:rPr>
           <w:t xml:space="preserve">DiffuMon</w:t>
         </w:r>
       </w:hyperlink>
@@ -868,11 +1206,36 @@
         <w:t xml:space="preserve"> </w:t>
       </w:r>
       <w:r>
-        <w:t xml:space="preserve">— Open-source denoising diffusion probabilistic model (DDPM) image generator.</w:t>
-      </w:r>
-    </w:p>
-    <w:bookmarkEnd w:id="36"/>
-    <w:bookmarkEnd w:id="37"/>
+        <w:t xml:space="preserve">• Open-source image generation</w:t>
+      </w:r>
+    </w:p>
+    <w:p>
+      <w:pPr>
+        <w:pStyle w:val="FirstParagraph"/>
+        <w:numPr>
+          <w:ilvl w:val="0"/>
+          <w:numId w:val="1010"/>
+        </w:numPr>
+      </w:pPr>
+      <w:r>
+        <w:t xml:space="preserve">Implemented denoising diffusion probabilistic models (DDPM) in PyTorch as an educational paper reproduction, with denoising diffusion implicit model (DDIM) sampling support.</w:t>
+      </w:r>
+    </w:p>
+    <w:p>
+      <w:pPr>
+        <w:pStyle w:val="FirstParagraph"/>
+        <w:numPr>
+          <w:ilvl w:val="0"/>
+          <w:numId w:val="1010"/>
+        </w:numPr>
+      </w:pPr>
+      <w:r>
+        <w:t xml:space="preserve">Provided pretrained Fashion MNIST and Pokémon image models, training and sampling commands, configurable datasets, and example notebooks. Designed the implementation to train on a commodity GPU.</w:t>
+      </w:r>
+    </w:p>
+    <w:bookmarkEnd w:id="52"/>
+    <w:bookmarkEnd w:id="53"/>
+    <w:bookmarkEnd w:id="54"/>
     <w:sectPr>
       <w:footnotePr>
         <w:numRestart w:val="eachSect"/>
@@ -1096,6 +1459,27 @@
     <w:abstractNumId w:val="991"/>
   </w:num>
   <w:num w:numId="1003">
+    <w:abstractNumId w:val="991"/>
+  </w:num>
+  <w:num w:numId="1004">
+    <w:abstractNumId w:val="991"/>
+  </w:num>
+  <w:num w:numId="1005">
+    <w:abstractNumId w:val="991"/>
+  </w:num>
+  <w:num w:numId="1006">
+    <w:abstractNumId w:val="991"/>
+  </w:num>
+  <w:num w:numId="1007">
+    <w:abstractNumId w:val="991"/>
+  </w:num>
+  <w:num w:numId="1008">
+    <w:abstractNumId w:val="991"/>
+  </w:num>
+  <w:num w:numId="1009">
+    <w:abstractNumId w:val="991"/>
+  </w:num>
+  <w:num w:numId="1010">
     <w:abstractNumId w:val="991"/>
   </w:num>
 </w:numbering>

</xml_diff>

<commit_message>
Apply resume PR feedback and regenerate exports
</commit_message>
<xml_diff>
--- a/LawrenceDuResume.docx
+++ b/LawrenceDuResume.docx
@@ -20,7 +20,7 @@
           <w:b/>
           <w:bCs/>
         </w:rPr>
-        <w:t xml:space="preserve">Machine Learning Engineering • Computational Biology • MLOps</w:t>
+        <w:t xml:space="preserve">Machine Learning • Biology • MLOps</w:t>
       </w:r>
     </w:p>
     <w:p>
@@ -71,33 +71,8 @@
           <w:t xml:space="preserve">linkedin.com/in/LarsDu</w:t>
         </w:r>
       </w:hyperlink>
-      <w:r>
-        <w:t xml:space="preserve"> </w:t>
-      </w:r>
-      <w:r>
-        <w:t xml:space="preserve">|</w:t>
-      </w:r>
-      <w:r>
-        <w:t xml:space="preserve"> </w:t>
-      </w:r>
-      <w:hyperlink r:id="rId12">
-        <w:r>
-          <w:rPr>
-            <w:rStyle w:val="Hyperlink"/>
-          </w:rPr>
-          <w:t xml:space="preserve">dublog.net</w:t>
-        </w:r>
-      </w:hyperlink>
-    </w:p>
-    <w:p>
-      <w:pPr>
-        <w:pStyle w:val="FirstParagraph"/>
-      </w:pPr>
-      <w:r>
-        <w:t xml:space="preserve">Machine learning engineer and biology Ph.D. with experience building scientific AI systems, distributed training platforms, and production models. Work spans sequence foundation models, computer vision, LLM applications, genomics, and experimental molecular biology.</w:t>
-      </w:r>
-    </w:p>
-    <w:bookmarkStart w:id="17" w:name="_skills"/>
+    </w:p>
+    <w:bookmarkStart w:id="16" w:name="_skills"/>
     <w:p>
       <w:pPr>
         <w:pStyle w:val="Heading2"/>
@@ -106,7 +81,7 @@
         <w:t xml:space="preserve">Skills</w:t>
       </w:r>
     </w:p>
-    <w:bookmarkStart w:id="13" w:name="_languages"/>
+    <w:bookmarkStart w:id="12" w:name="_languages"/>
     <w:p>
       <w:pPr>
         <w:pStyle w:val="Heading4"/>
@@ -123,62 +98,62 @@
         <w:t xml:space="preserve">Python, SQL, C/C++, C#, Rust, Java, Dart, Bash, HTML/CSS, MATLAB</w:t>
       </w:r>
     </w:p>
+    <w:bookmarkEnd w:id="12"/>
+    <w:bookmarkStart w:id="13" w:name="_4172ea3214963054a0d0bc65a67a59934a4a290"/>
+    <w:p>
+      <w:pPr>
+        <w:pStyle w:val="Heading4"/>
+      </w:pPr>
+      <w:r>
+        <w:t xml:space="preserve">ML and data tools</w:t>
+      </w:r>
+    </w:p>
+    <w:p>
+      <w:pPr>
+        <w:pStyle w:val="FirstParagraph"/>
+      </w:pPr>
+      <w:r>
+        <w:t xml:space="preserve">PyTorch, TensorFlow, scikit-learn (sklearn), NumPy, SciPy, pandas, Numba, Ray, MLflow, Flask, Jupyter</w:t>
+      </w:r>
+    </w:p>
     <w:bookmarkEnd w:id="13"/>
-    <w:bookmarkStart w:id="14" w:name="_4172ea3214963054a0d0bc65a67a59934a4a290"/>
+    <w:bookmarkStart w:id="14" w:name="_e050a77dc03158d346a856e1214f3a30302e0fc"/>
     <w:p>
       <w:pPr>
         <w:pStyle w:val="Heading4"/>
       </w:pPr>
       <w:r>
-        <w:t xml:space="preserve">ML and data tools</w:t>
-      </w:r>
-    </w:p>
-    <w:p>
-      <w:pPr>
-        <w:pStyle w:val="FirstParagraph"/>
-      </w:pPr>
-      <w:r>
-        <w:t xml:space="preserve">PyTorch, TensorFlow, JAX, scikit-learn (sklearn), NumPy, SciPy, pandas, Numba, Ray, MLflow, Flask, Jupyter</w:t>
+        <w:t xml:space="preserve">Cloud and MLOps</w:t>
+      </w:r>
+    </w:p>
+    <w:p>
+      <w:pPr>
+        <w:pStyle w:val="FirstParagraph"/>
+      </w:pPr>
+      <w:r>
+        <w:t xml:space="preserve">Amazon Web Services (AWS: EC2, S3, Batch, Glue, Athena, Fargate), Google Cloud Platform (GCP), Kubernetes, Docker, Terraform, Pulumi, Metaflow, GitHub Actions, Jenkins, Linux</w:t>
       </w:r>
     </w:p>
     <w:bookmarkEnd w:id="14"/>
-    <w:bookmarkStart w:id="15" w:name="_e050a77dc03158d346a856e1214f3a30302e0fc"/>
+    <w:bookmarkStart w:id="15" w:name="_2f40e396a96bd75e83bf646a2f51fdeb02c03d4"/>
     <w:p>
       <w:pPr>
         <w:pStyle w:val="Heading4"/>
       </w:pPr>
       <w:r>
-        <w:t xml:space="preserve">Cloud and MLOps</w:t>
-      </w:r>
-    </w:p>
-    <w:p>
-      <w:pPr>
-        <w:pStyle w:val="FirstParagraph"/>
-      </w:pPr>
-      <w:r>
-        <w:t xml:space="preserve">Amazon Web Services (AWS: EC2, S3, Batch, Glue, Athena, Fargate), Google Cloud Platform (GCP), Kubernetes, Docker, Terraform, Pulumi, Metaflow, Jenkins, Linux</w:t>
+        <w:t xml:space="preserve">ML and scientific computing</w:t>
+      </w:r>
+    </w:p>
+    <w:p>
+      <w:pPr>
+        <w:pStyle w:val="FirstParagraph"/>
+      </w:pPr>
+      <w:r>
+        <w:t xml:space="preserve">Low-rank adaptation (LoRA), sparse autoencoders (SAE), Joint Embedding Predictive Architecture (JEPA), foundation model fine-tuning, deep learning, transformers, convolutional neural networks (CNNs), graph neural networks (GNNs), GANs, diffusion, Louvain/Leiden community detection, SVM, PCA, KNN, decision trees, cross-validation</w:t>
       </w:r>
     </w:p>
     <w:bookmarkEnd w:id="15"/>
-    <w:bookmarkStart w:id="16" w:name="_2f40e396a96bd75e83bf646a2f51fdeb02c03d4"/>
-    <w:p>
-      <w:pPr>
-        <w:pStyle w:val="Heading4"/>
-      </w:pPr>
-      <w:r>
-        <w:t xml:space="preserve">ML and scientific computing</w:t>
-      </w:r>
-    </w:p>
-    <w:p>
-      <w:pPr>
-        <w:pStyle w:val="FirstParagraph"/>
-      </w:pPr>
-      <w:r>
-        <w:t xml:space="preserve">Foundation model fine-tuning, deep learning, transformers, convolutional neural networks (CNNs), graph neural networks (GNNs), generative adversarial networks (GANs), diffusion, Louvain/Leiden community detection, SVM, PCA, KNN, decision trees, cross-validation</w:t>
-      </w:r>
-    </w:p>
     <w:bookmarkEnd w:id="16"/>
-    <w:bookmarkEnd w:id="17"/>
     <w:bookmarkStart w:id="42" w:name="_experience"/>
     <w:p>
       <w:pPr>
@@ -188,12 +163,12 @@
         <w:t xml:space="preserve">Experience</w:t>
       </w:r>
     </w:p>
-    <w:bookmarkStart w:id="20" w:name="_dcc5a053e1bcdfd5ff2a6425066a825e929a4b5"/>
+    <w:bookmarkStart w:id="19" w:name="_dcc5a053e1bcdfd5ff2a6425066a825e929a4b5"/>
     <w:p>
       <w:pPr>
         <w:pStyle w:val="Heading3"/>
       </w:pPr>
-      <w:hyperlink r:id="rId18">
+      <w:hyperlink r:id="rId17">
         <w:r>
           <w:rPr>
             <w:rStyle w:val="Hyperlink"/>
@@ -208,7 +183,7 @@
         <w:t xml:space="preserve">• Senior AI/ML Engineer, Sequence Learning and Phenomics</w:t>
       </w:r>
     </w:p>
-    <w:bookmarkStart w:id="19" w:name="_3a525e7ac7973c43e29d649fc78f101dcff82e4"/>
+    <w:bookmarkStart w:id="18" w:name="_3a525e7ac7973c43e29d649fc78f101dcff82e4"/>
     <w:p>
       <w:pPr>
         <w:pStyle w:val="Heading5"/>
@@ -226,7 +201,19 @@
         </w:numPr>
       </w:pPr>
       <w:r>
-        <w:t xml:space="preserve">Built an end-to-end fine-tuning platform for sequence foundation models, enabling internal teams to predict RNA properties from nucleotide sequences and perturbation responses from single-cell RNA-seq. Cut iteration time</w:t>
+        <w:t xml:space="preserve">Built an end-to-end fine-tuning platform for sequence foundation models, enabling internal teams to predict RNA properties from nucleotide sequences and perturbation responses from single-cell RNA-seq.</w:t>
+      </w:r>
+    </w:p>
+    <w:p>
+      <w:pPr>
+        <w:pStyle w:val="BodyText"/>
+        <w:numPr>
+          <w:ilvl w:val="0"/>
+          <w:numId w:val="1000"/>
+        </w:numPr>
+      </w:pPr>
+      <w:r>
+        <w:t xml:space="preserve">Cut iteration time</w:t>
       </w:r>
       <w:r>
         <w:t xml:space="preserve"> </w:t>
@@ -251,7 +238,7 @@
         </w:numPr>
       </w:pPr>
       <w:r>
-        <w:t xml:space="preserve">Integrated Segment Anything Model (SAM) image segmentation into production computer vision and image-embedding pipelines, enabling single-cell tracking and cell-state world modeling across</w:t>
+        <w:t xml:space="preserve">Integrated Cellpose-SAM, combining Cellpose and the Segment Anything Model (SAM), into production computer vision and image-embedding pipelines for image segmentation, enabling single-cell tracking and cell-state world modeling across</w:t>
       </w:r>
       <w:r>
         <w:t xml:space="preserve"> </w:t>
@@ -276,7 +263,7 @@
         </w:numPr>
       </w:pPr>
       <w:r>
-        <w:t xml:space="preserve">Designed embedding-based differentiation quality control (QC) that scored</w:t>
+        <w:t xml:space="preserve">Built a zero-shot image-embedding model to predict iPSC-to-microglia differentiation success, scoring</w:t>
       </w:r>
       <w:r>
         <w:t xml:space="preserve"> </w:t>
@@ -286,10 +273,41 @@
           <w:b/>
           <w:bCs/>
         </w:rPr>
-        <w:t xml:space="preserve">&gt;3 million iPSC-to-microglia cells</w:t>
-      </w:r>
-      <w:r>
-        <w:t xml:space="preserve">, supporting active Alzheimer’s disease research.</w:t>
+        <w:t xml:space="preserve">&gt;3 million cells</w:t>
+      </w:r>
+      <w:r>
+        <w:t xml:space="preserve"> </w:t>
+      </w:r>
+      <w:r>
+        <w:t xml:space="preserve">for active Alzheimer’s disease research and saving</w:t>
+      </w:r>
+      <w:r>
+        <w:t xml:space="preserve"> </w:t>
+      </w:r>
+      <w:r>
+        <w:rPr>
+          <w:b/>
+          <w:bCs/>
+        </w:rPr>
+        <w:t xml:space="preserve">up to six weeks of labor</w:t>
+      </w:r>
+      <w:r>
+        <w:t xml:space="preserve"> </w:t>
+      </w:r>
+      <w:r>
+        <w:t xml:space="preserve">on two-month differentiation protocols.</w:t>
+      </w:r>
+    </w:p>
+    <w:p>
+      <w:pPr>
+        <w:pStyle w:val="BodyText"/>
+        <w:numPr>
+          <w:ilvl w:val="0"/>
+          <w:numId w:val="1000"/>
+        </w:numPr>
+      </w:pPr>
+      <w:r>
+        <w:t xml:space="preserve">Used sparse autoencoders to extract interpretable features.</w:t>
       </w:r>
     </w:p>
     <w:p>
@@ -313,7 +331,19 @@
         </w:numPr>
       </w:pPr>
       <w:r>
-        <w:t xml:space="preserve">Built a pipeline using large language models (LLMs) for retrieval-augmented generation (RAG) and gene-candidate evaluation. Prioritized</w:t>
+        <w:t xml:space="preserve">Built a pipeline using large language models (LLMs) for retrieval-augmented generation (RAG) and gene-candidate evaluation.</w:t>
+      </w:r>
+    </w:p>
+    <w:p>
+      <w:pPr>
+        <w:pStyle w:val="BodyText"/>
+        <w:numPr>
+          <w:ilvl w:val="0"/>
+          <w:numId w:val="1000"/>
+        </w:numPr>
+      </w:pPr>
+      <w:r>
+        <w:t xml:space="preserve">Prioritized</w:t>
       </w:r>
       <w:r>
         <w:t xml:space="preserve"> </w:t>
@@ -366,17 +396,17 @@
         </w:numPr>
       </w:pPr>
       <w:r>
-        <w:t xml:space="preserve">Contributing to LLM benchmarking currently in development; conducted interviews to support hiring on the team.</w:t>
-      </w:r>
-    </w:p>
+        <w:t xml:space="preserve">Contributing to benchmarking tasks for open-weight and commercial LLMs (currently in development); led software engineering interviews to support hiring on the team.</w:t>
+      </w:r>
+    </w:p>
+    <w:bookmarkEnd w:id="18"/>
     <w:bookmarkEnd w:id="19"/>
-    <w:bookmarkEnd w:id="20"/>
-    <w:bookmarkStart w:id="23" w:name="_2470f9df5c73068d7cec7dd91f48e88377ff3e7"/>
+    <w:bookmarkStart w:id="22" w:name="_2470f9df5c73068d7cec7dd91f48e88377ff3e7"/>
     <w:p>
       <w:pPr>
         <w:pStyle w:val="Heading3"/>
       </w:pPr>
-      <w:hyperlink r:id="rId21">
+      <w:hyperlink r:id="rId20">
         <w:r>
           <w:rPr>
             <w:rStyle w:val="Hyperlink"/>
@@ -391,7 +421,7 @@
         <w:t xml:space="preserve">• Senior Machine Learning Research Engineer</w:t>
       </w:r>
     </w:p>
-    <w:bookmarkStart w:id="22" w:name="_a3336994878c0ad5b79f63603847d0031816c36"/>
+    <w:bookmarkStart w:id="21" w:name="_a3336994878c0ad5b79f63603847d0031816c36"/>
     <w:p>
       <w:pPr>
         <w:pStyle w:val="Heading5"/>
@@ -409,7 +439,19 @@
         </w:numPr>
       </w:pPr>
       <w:r>
-        <w:t xml:space="preserve">Led a greenfield distributed ML platform project using PyTorch, Ray, and Kubernetes for cancer detection from methylated DNA and protein data. Enabled larger models and accelerated model training</w:t>
+        <w:t xml:space="preserve">Led a greenfield distributed ML platform project using PyTorch, Ray, and Kubernetes for cancer detection from methylated DNA and protein data.</w:t>
+      </w:r>
+    </w:p>
+    <w:p>
+      <w:pPr>
+        <w:pStyle w:val="BodyText"/>
+        <w:numPr>
+          <w:ilvl w:val="0"/>
+          <w:numId w:val="1000"/>
+        </w:numPr>
+      </w:pPr>
+      <w:r>
+        <w:t xml:space="preserve">Enabled larger models and accelerated model training</w:t>
       </w:r>
       <w:r>
         <w:t xml:space="preserve"> </w:t>
@@ -437,7 +479,19 @@
         </w:numPr>
       </w:pPr>
       <w:r>
-        <w:t xml:space="preserve">Deployed organization-wide MLflow experiment tracking on GCP using Terraform and Pulumi. Enabled live training monitoring, results sharing, and automated reproducible reports, reducing manual researcher effort</w:t>
+        <w:t xml:space="preserve">Deployed organization-wide MLflow experiment tracking on GCP using Terraform and Pulumi.</w:t>
+      </w:r>
+    </w:p>
+    <w:p>
+      <w:pPr>
+        <w:pStyle w:val="BodyText"/>
+        <w:numPr>
+          <w:ilvl w:val="0"/>
+          <w:numId w:val="1000"/>
+        </w:numPr>
+      </w:pPr>
+      <w:r>
+        <w:t xml:space="preserve">Enabled live training monitoring, results sharing, and automated reproducible reports, reducing manual researcher effort</w:t>
       </w:r>
       <w:r>
         <w:t xml:space="preserve"> </w:t>
@@ -478,26 +532,14 @@
         <w:t xml:space="preserve">.</w:t>
       </w:r>
     </w:p>
-    <w:p>
-      <w:pPr>
-        <w:pStyle w:val="FirstParagraph"/>
-        <w:numPr>
-          <w:ilvl w:val="0"/>
-          <w:numId w:val="1002"/>
-        </w:numPr>
-      </w:pPr>
-      <w:r>
-        <w:t xml:space="preserve">Piloted biomedical natural language processing (NLP) with GPT-4 and an open-source LLM fine-tuned using direct preference optimization (DPO). Demonstrated literature summarization and feature extraction from unstructured biomedical records.</w:t>
-      </w:r>
-    </w:p>
+    <w:bookmarkEnd w:id="21"/>
     <w:bookmarkEnd w:id="22"/>
-    <w:bookmarkEnd w:id="23"/>
-    <w:bookmarkStart w:id="26" w:name="_c77c3cdf22b3b4f40361cf53490a0ad022b9e8e"/>
+    <w:bookmarkStart w:id="25" w:name="_c77c3cdf22b3b4f40361cf53490a0ad022b9e8e"/>
     <w:p>
       <w:pPr>
         <w:pStyle w:val="Heading3"/>
       </w:pPr>
-      <w:hyperlink r:id="rId24">
+      <w:hyperlink r:id="rId23">
         <w:r>
           <w:rPr>
             <w:rStyle w:val="Hyperlink"/>
@@ -512,7 +554,7 @@
         <w:t xml:space="preserve">• Machine Learning Engineer</w:t>
       </w:r>
     </w:p>
-    <w:bookmarkStart w:id="25" w:name="_ff7e09be4b3df37f494f3cb3965eb3a575ef17b"/>
+    <w:bookmarkStart w:id="24" w:name="_ff7e09be4b3df37f494f3cb3965eb3a575ef17b"/>
     <w:p>
       <w:pPr>
         <w:pStyle w:val="Heading5"/>
@@ -530,7 +572,19 @@
         </w:numPr>
       </w:pPr>
       <w:r>
-        <w:t xml:space="preserve">Built large-scale data pipelines for quality statistics and feature engineering of genotyped and imputed single-nucleotide polymorphisms (SNPs). Implemented extract, transform, load (ETL) workflows for</w:t>
+        <w:t xml:space="preserve">Built large-scale data pipelines for quality statistics and feature engineering of genotyped and imputed single-nucleotide polymorphisms (SNPs).</w:t>
+      </w:r>
+    </w:p>
+    <w:p>
+      <w:pPr>
+        <w:pStyle w:val="BodyText"/>
+        <w:numPr>
+          <w:ilvl w:val="0"/>
+          <w:numId w:val="1000"/>
+        </w:numPr>
+      </w:pPr>
+      <w:r>
+        <w:t xml:space="preserve">Implemented extract, transform, load (ETL) workflows for</w:t>
       </w:r>
       <w:r>
         <w:t xml:space="preserve"> </w:t>
@@ -558,7 +612,7 @@
         </w:numPr>
       </w:pPr>
       <w:r>
-        <w:t xml:space="preserve">Improved type 2 diabetes and coronary artery disease PRS models through stacking ensembles in production pipelines. Improved sensitivity and specificity for</w:t>
+        <w:t xml:space="preserve">Improved type 2 diabetes and coronary artery disease PRS models through stacking ensembles in production pipelines, improving sensitivity and specificity for</w:t>
       </w:r>
       <w:r>
         <w:t xml:space="preserve"> </w:t>
@@ -568,10 +622,10 @@
           <w:b/>
           <w:bCs/>
         </w:rPr>
-        <w:t xml:space="preserve">tens of thousands of customers</w:t>
-      </w:r>
-      <w:r>
-        <w:t xml:space="preserve">, evaluating models using area under the ROC curve (AUC) and precision-recall curve (auPRC) metrics.</w:t>
+        <w:t xml:space="preserve">&gt;400,000 customers</w:t>
+      </w:r>
+      <w:r>
+        <w:t xml:space="preserve">. Evaluated performance using AUC and auPRC.</w:t>
       </w:r>
     </w:p>
     <w:p>
@@ -599,9 +653,9 @@
         <w:t xml:space="preserve">.</w:t>
       </w:r>
     </w:p>
+    <w:bookmarkEnd w:id="24"/>
     <w:bookmarkEnd w:id="25"/>
-    <w:bookmarkEnd w:id="26"/>
-    <w:bookmarkStart w:id="28" w:name="_865699a62172e282011d0143d7a1646e8335f9a"/>
+    <w:bookmarkStart w:id="27" w:name="_865699a62172e282011d0143d7a1646e8335f9a"/>
     <w:p>
       <w:pPr>
         <w:pStyle w:val="Heading3"/>
@@ -610,7 +664,7 @@
         <w:t xml:space="preserve">23andMe • Data Scientist, Ancestry Product</w:t>
       </w:r>
     </w:p>
-    <w:bookmarkStart w:id="27" w:name="_a0fdeee4e29474480969f1191725ea9b8c1b4ed"/>
+    <w:bookmarkStart w:id="26" w:name="_a0fdeee4e29474480969f1191725ea9b8c1b4ed"/>
     <w:p>
       <w:pPr>
         <w:pStyle w:val="Heading5"/>
@@ -644,7 +698,7 @@
         <w:t xml:space="preserve"> </w:t>
       </w:r>
       <w:r>
-        <w:t xml:space="preserve">worldwide. Deployed the model as an AWS Fargate microservice with MLflow artifact tracking.</w:t>
+        <w:t xml:space="preserve">worldwide. Deployed the model as an AWS Fargate microservice, using MLflow for experiment tracking and a model repository.</w:t>
       </w:r>
     </w:p>
     <w:p>
@@ -659,14 +713,14 @@
         <w:t xml:space="preserve">Improved graph-based techniques for identifying genetic populations from identity-by-descent (IBD) family relationships. Used graph community detection to identify subpopulations in Mexico and the United Kingdom.</w:t>
       </w:r>
     </w:p>
+    <w:bookmarkEnd w:id="26"/>
     <w:bookmarkEnd w:id="27"/>
-    <w:bookmarkEnd w:id="28"/>
-    <w:bookmarkStart w:id="31" w:name="_f58706a2979db3ce43a770e11687fb9cb87b8ae"/>
+    <w:bookmarkStart w:id="30" w:name="_f58706a2979db3ce43a770e11687fb9cb87b8ae"/>
     <w:p>
       <w:pPr>
         <w:pStyle w:val="Heading3"/>
       </w:pPr>
-      <w:hyperlink r:id="rId29">
+      <w:hyperlink r:id="rId28">
         <w:r>
           <w:rPr>
             <w:rStyle w:val="Hyperlink"/>
@@ -681,7 +735,7 @@
         <w:t xml:space="preserve">• Bioinformatician IV</w:t>
       </w:r>
     </w:p>
-    <w:bookmarkStart w:id="30" w:name="_19757c96fc6fc0ef1edefe5c09f80a60d696f5f"/>
+    <w:bookmarkStart w:id="29" w:name="_19757c96fc6fc0ef1edefe5c09f80a60d696f5f"/>
     <w:p>
       <w:pPr>
         <w:pStyle w:val="Heading5"/>
@@ -730,14 +784,14 @@
         <w:t xml:space="preserve">genome assembly, and variant calling.</w:t>
       </w:r>
     </w:p>
+    <w:bookmarkEnd w:id="29"/>
     <w:bookmarkEnd w:id="30"/>
-    <w:bookmarkEnd w:id="31"/>
     <w:bookmarkStart w:id="34" w:name="_585b308482c8fa20892f128c8222f0a786707a7"/>
     <w:p>
       <w:pPr>
         <w:pStyle w:val="Heading3"/>
       </w:pPr>
-      <w:hyperlink r:id="rId32">
+      <w:hyperlink r:id="rId31">
         <w:r>
           <w:rPr>
             <w:rStyle w:val="Hyperlink"/>
@@ -770,7 +824,21 @@
         </w:numPr>
       </w:pPr>
       <w:r>
-        <w:t xml:space="preserve">Developed a TensorFlow deep learning software package for detecting prenatal genetic abnormalities from high-throughput sequencing data; co-invented a patent for deep learning-based prenatal testing.</w:t>
+        <w:t xml:space="preserve">Developed a TensorFlow deep learning software package for detecting prenatal genetic abnormalities from high-throughput sequencing data; co-invented</w:t>
+      </w:r>
+      <w:r>
+        <w:t xml:space="preserve"> </w:t>
+      </w:r>
+      <w:hyperlink r:id="rId32">
+        <w:r>
+          <w:rPr>
+            <w:rStyle w:val="Hyperlink"/>
+          </w:rPr>
+          <w:t xml:space="preserve">US20210020314A1: Deep learning-based prenatal testing</w:t>
+        </w:r>
+      </w:hyperlink>
+      <w:r>
+        <w:t xml:space="preserve">.</w:t>
       </w:r>
     </w:p>
     <w:p>
@@ -1035,108 +1103,181 @@
     </w:p>
     <w:bookmarkEnd w:id="44"/>
     <w:bookmarkEnd w:id="45"/>
-    <w:bookmarkStart w:id="48" w:name="_d37f4d90a711ff5d4d14ef973643b4af6be8ab1"/>
+    <w:bookmarkStart w:id="53" w:name="_0298a962c23cd1992c7043cc3ea52f6489bf7e9"/>
     <w:p>
       <w:pPr>
         <w:pStyle w:val="Heading2"/>
       </w:pPr>
       <w:r>
-        <w:t xml:space="preserve">Selected Publication and Patent</w:t>
-      </w:r>
-    </w:p>
-    <w:p>
-      <w:pPr>
-        <w:pStyle w:val="FirstParagraph"/>
-      </w:pPr>
+        <w:t xml:space="preserve">Side Projects</w:t>
+      </w:r>
+    </w:p>
+    <w:p>
+      <w:pPr>
+        <w:pStyle w:val="FirstParagraph"/>
+        <w:numPr>
+          <w:ilvl w:val="0"/>
+          <w:numId w:val="1009"/>
+        </w:numPr>
+      </w:pPr>
+      <w:hyperlink r:id="rId46">
+        <w:r>
+          <w:rPr>
+            <w:rStyle w:val="Hyperlink"/>
+            <w:b/>
+            <w:bCs/>
+          </w:rPr>
+          <w:t xml:space="preserve">Rogue Stargun</w:t>
+        </w:r>
+      </w:hyperlink>
+      <w:r>
+        <w:t xml:space="preserve"> </w:t>
+      </w:r>
+      <w:r>
+        <w:t xml:space="preserve">— Unity/C# VR game with</w:t>
+      </w:r>
+      <w:r>
+        <w:t xml:space="preserve"> </w:t>
+      </w:r>
       <w:r>
         <w:rPr>
           <w:b/>
           <w:bCs/>
         </w:rPr>
-        <w:t xml:space="preserve">Du et al. (2016).</w:t>
-      </w:r>
-      <w:r>
-        <w:t xml:space="preserve"> </w:t>
-      </w:r>
-      <w:hyperlink r:id="rId46">
-        <w:r>
-          <w:rPr>
-            <w:rStyle w:val="Hyperlink"/>
-          </w:rPr>
-          <w:t xml:space="preserve">Mutagenesis of GATA motifs controlling the endoderm regulator elt-2 reveals distinct dominant and secondary cis-regulatory elements</w:t>
-        </w:r>
-      </w:hyperlink>
-      <w:r>
-        <w:t xml:space="preserve">.</w:t>
-      </w:r>
-      <w:r>
-        <w:t xml:space="preserve"> </w:t>
-      </w:r>
-      <w:r>
-        <w:rPr>
-          <w:i/>
-          <w:iCs/>
-        </w:rPr>
-        <w:t xml:space="preserve">Developmental Biology</w:t>
-      </w:r>
-      <w:r>
-        <w:t xml:space="preserve">, 412(1), 160–170.</w:t>
-      </w:r>
-    </w:p>
-    <w:p>
-      <w:pPr>
-        <w:pStyle w:val="BodyText"/>
-      </w:pPr>
+        <w:t xml:space="preserve">&gt;10,000 installs</w:t>
+      </w:r>
+      <w:r>
+        <w:t xml:space="preserve"> </w:t>
+      </w:r>
+      <w:r>
+        <w:t xml:space="preserve">across Steam, Quest, and PICO;</w:t>
+      </w:r>
+      <w:r>
+        <w:t xml:space="preserve"> </w:t>
+      </w:r>
       <w:r>
         <w:rPr>
           <w:b/>
           <w:bCs/>
         </w:rPr>
-        <w:t xml:space="preserve">Co-inventor:</w:t>
-      </w:r>
-      <w:r>
-        <w:t xml:space="preserve"> </w:t>
-      </w:r>
+        <w:t xml:space="preserve">4.7/5 on Meta Quest</w:t>
+      </w:r>
+      <w:r>
+        <w:t xml:space="preserve">. Frontier LLMs and ElevenLabs text-to-speech in</w:t>
+      </w:r>
+      <w:r>
+        <w:t xml:space="preserve"> </w:t>
+      </w:r>
+      <w:r>
+        <w:rPr>
+          <w:b/>
+          <w:bCs/>
+        </w:rPr>
+        <w:t xml:space="preserve">nine languages</w:t>
+      </w:r>
+      <w:r>
+        <w:t xml:space="preserve">; dogfighting AI with collision avoidance, firing intercept, and behavior trees for</w:t>
+      </w:r>
+      <w:r>
+        <w:t xml:space="preserve"> </w:t>
+      </w:r>
+      <w:r>
+        <w:rPr>
+          <w:b/>
+          <w:bCs/>
+        </w:rPr>
+        <w:t xml:space="preserve">40+ concurrent ships</w:t>
+      </w:r>
+      <w:r>
+        <w:t xml:space="preserve">. Shader and rendering/batch optimization:</w:t>
+      </w:r>
+      <w:r>
+        <w:t xml:space="preserve"> </w:t>
+      </w:r>
+      <w:r>
+        <w:rPr>
+          <w:b/>
+          <w:bCs/>
+        </w:rPr>
+        <w:t xml:space="preserve">72 FPS on Quest 2, 90+ FPS on Quest 3 and PICO Ultra 4</w:t>
+      </w:r>
+      <w:r>
+        <w:t xml:space="preserve">.</w:t>
+      </w:r>
+    </w:p>
+    <w:p>
+      <w:pPr>
+        <w:pStyle w:val="FirstParagraph"/>
+        <w:numPr>
+          <w:ilvl w:val="0"/>
+          <w:numId w:val="1009"/>
+        </w:numPr>
+      </w:pPr>
       <w:hyperlink r:id="rId47">
         <w:r>
           <w:rPr>
             <w:rStyle w:val="Hyperlink"/>
+            <w:b/>
+            <w:bCs/>
           </w:rPr>
-          <w:t xml:space="preserve">US20210020314A1: Deep learning-based prenatal testing</w:t>
+          <w:t xml:space="preserve">DiffuMon</w:t>
         </w:r>
       </w:hyperlink>
       <w:r>
-        <w:t xml:space="preserve">.</w:t>
-      </w:r>
-    </w:p>
-    <w:bookmarkEnd w:id="48"/>
-    <w:bookmarkStart w:id="53" w:name="_2bfd2208116bc8760116e98d98c4644648e3554"/>
-    <w:p>
-      <w:pPr>
-        <w:pStyle w:val="Heading2"/>
-      </w:pPr>
-      <w:r>
-        <w:t xml:space="preserve">Selected Projects</w:t>
-      </w:r>
-    </w:p>
-    <w:bookmarkStart w:id="50" w:name="_4e00e1c622cbd41882b11d79050c18920b5bba6"/>
-    <w:p>
-      <w:pPr>
-        <w:pStyle w:val="Heading4"/>
+        <w:t xml:space="preserve"> </w:t>
+      </w:r>
+      <w:r>
+        <w:t xml:space="preserve">— Open-source PyTorch DDPM/DDIM image generator and paper reproduction for commodity GPUs.</w:t>
+      </w:r>
+    </w:p>
+    <w:p>
+      <w:pPr>
+        <w:pStyle w:val="FirstParagraph"/>
+        <w:numPr>
+          <w:ilvl w:val="0"/>
+          <w:numId w:val="1009"/>
+        </w:numPr>
+      </w:pPr>
+      <w:hyperlink r:id="rId48">
+        <w:r>
+          <w:rPr>
+            <w:rStyle w:val="Hyperlink"/>
+            <w:b/>
+            <w:bCs/>
+          </w:rPr>
+          <w:t xml:space="preserve">DuBlog</w:t>
+        </w:r>
+      </w:hyperlink>
+      <w:r>
+        <w:t xml:space="preserve"> </w:t>
+      </w:r>
+      <w:r>
+        <w:t xml:space="preserve">— Technical writing and experimentation with Rust, Bevy, and WebAssembly.</w:t>
+      </w:r>
+    </w:p>
+    <w:p>
+      <w:pPr>
+        <w:pStyle w:val="FirstParagraph"/>
+        <w:numPr>
+          <w:ilvl w:val="0"/>
+          <w:numId w:val="1009"/>
+        </w:numPr>
       </w:pPr>
       <w:hyperlink r:id="rId49">
         <w:r>
           <w:rPr>
             <w:rStyle w:val="Hyperlink"/>
+            <w:b/>
+            <w:bCs/>
           </w:rPr>
-          <w:t xml:space="preserve">Rogue Stargun</w:t>
+          <w:t xml:space="preserve">Dippy6502</w:t>
         </w:r>
       </w:hyperlink>
       <w:r>
         <w:t xml:space="preserve"> </w:t>
       </w:r>
       <w:r>
-        <w:t xml:space="preserve">• Unity / C# VR space simulator</w:t>
+        <w:t xml:space="preserve">— AI-assisted MOS6502 emulator with full pinout voltage visualization.</w:t>
       </w:r>
     </w:p>
     <w:p>
@@ -1147,8 +1288,21 @@
           <w:numId w:val="1009"/>
         </w:numPr>
       </w:pPr>
-      <w:r>
-        <w:t xml:space="preserve">Built spaceship controllers, collision avoidance and firing prediction algorithms, and behavior trees for AI flight planning and decision making.</w:t>
+      <w:hyperlink r:id="rId50">
+        <w:r>
+          <w:rPr>
+            <w:rStyle w:val="Hyperlink"/>
+            <w:b/>
+            <w:bCs/>
+          </w:rPr>
+          <w:t xml:space="preserve">PanelPanic</w:t>
+        </w:r>
+      </w:hyperlink>
+      <w:r>
+        <w:t xml:space="preserve"> </w:t>
+      </w:r>
+      <w:r>
+        <w:t xml:space="preserve">— Rust/Macroquad Panel de Pon adaptation with WebRTC online multiplayer.</w:t>
       </w:r>
     </w:p>
     <w:p>
@@ -1158,82 +1312,49 @@
           <w:ilvl w:val="0"/>
           <w:numId w:val="1009"/>
         </w:numPr>
-      </w:pPr>
-      <w:r>
-        <w:t xml:space="preserve">Integrated text-to-speech services from Google Cloud, Microsoft Azure, and ElevenLabs into the Unity editor to prototype campaign dialogue; built procedural mission and powerup generation.</w:t>
-      </w:r>
-    </w:p>
-    <w:p>
-      <w:pPr>
-        <w:pStyle w:val="FirstParagraph"/>
-        <w:numPr>
-          <w:ilvl w:val="0"/>
-          <w:numId w:val="1009"/>
-        </w:numPr>
-      </w:pPr>
-      <w:r>
-        <w:t xml:space="preserve">Optimized shaders and rendering/batch calls for constrained VR hardware, achieving</w:t>
-      </w:r>
-      <w:r>
-        <w:t xml:space="preserve"> </w:t>
-      </w:r>
-      <w:r>
-        <w:rPr>
-          <w:b/>
-          <w:bCs/>
-        </w:rPr>
-        <w:t xml:space="preserve">72 FPS on Meta Quest 2 and 90 FPS on Meta Quest 3</w:t>
-      </w:r>
-      <w:r>
-        <w:t xml:space="preserve">.</w:t>
-      </w:r>
-    </w:p>
-    <w:bookmarkEnd w:id="50"/>
-    <w:bookmarkStart w:id="52" w:name="_18cd080fed0f2379a5cbd48c3dda356cfcb3c18"/>
-    <w:p>
-      <w:pPr>
-        <w:pStyle w:val="Heading4"/>
       </w:pPr>
       <w:hyperlink r:id="rId51">
         <w:r>
           <w:rPr>
             <w:rStyle w:val="Hyperlink"/>
+            <w:b/>
+            <w:bCs/>
           </w:rPr>
-          <w:t xml:space="preserve">DiffuMon</w:t>
+          <w:t xml:space="preserve">StickerMoji</w:t>
         </w:r>
       </w:hyperlink>
       <w:r>
         <w:t xml:space="preserve"> </w:t>
       </w:r>
       <w:r>
-        <w:t xml:space="preserve">• Open-source image generation</w:t>
-      </w:r>
-    </w:p>
-    <w:p>
-      <w:pPr>
-        <w:pStyle w:val="FirstParagraph"/>
-        <w:numPr>
-          <w:ilvl w:val="0"/>
-          <w:numId w:val="1010"/>
-        </w:numPr>
-      </w:pPr>
-      <w:r>
-        <w:t xml:space="preserve">Implemented denoising diffusion probabilistic models (DDPM) in PyTorch as an educational paper reproduction, with denoising diffusion implicit model (DDIM) sampling support.</w:t>
-      </w:r>
-    </w:p>
-    <w:p>
-      <w:pPr>
-        <w:pStyle w:val="FirstParagraph"/>
-        <w:numPr>
-          <w:ilvl w:val="0"/>
-          <w:numId w:val="1010"/>
-        </w:numPr>
-      </w:pPr>
-      <w:r>
-        <w:t xml:space="preserve">Provided pretrained Fashion MNIST and Pokémon image models, training and sampling commands, configurable datasets, and example notebooks. Designed the implementation to train on a commodity GPU.</w:t>
-      </w:r>
-    </w:p>
-    <w:bookmarkEnd w:id="52"/>
+        <w:t xml:space="preserve">— Web app for ordering AI-generated stickers.</w:t>
+      </w:r>
+    </w:p>
+    <w:p>
+      <w:pPr>
+        <w:pStyle w:val="FirstParagraph"/>
+        <w:numPr>
+          <w:ilvl w:val="0"/>
+          <w:numId w:val="1009"/>
+        </w:numPr>
+      </w:pPr>
+      <w:hyperlink r:id="rId52">
+        <w:r>
+          <w:rPr>
+            <w:rStyle w:val="Hyperlink"/>
+            <w:b/>
+            <w:bCs/>
+          </w:rPr>
+          <w:t xml:space="preserve">TimursChess</w:t>
+        </w:r>
+      </w:hyperlink>
+      <w:r>
+        <w:t xml:space="preserve"> </w:t>
+      </w:r>
+      <w:r>
+        <w:t xml:space="preserve">— Rust/Macroquad implementation of Tamerlane Chess.</w:t>
+      </w:r>
+    </w:p>
     <w:bookmarkEnd w:id="53"/>
     <w:bookmarkEnd w:id="54"/>
     <w:sectPr>
@@ -1477,9 +1598,6 @@
     <w:abstractNumId w:val="991"/>
   </w:num>
   <w:num w:numId="1009">
-    <w:abstractNumId w:val="991"/>
-  </w:num>
-  <w:num w:numId="1010">
     <w:abstractNumId w:val="991"/>
   </w:num>
 </w:numbering>

</xml_diff>